<commit_message>
mqtt aus ferne geht mit cloud
</commit_message>
<xml_diff>
--- a/docs/MQTT_Anleitung.docx
+++ b/docs/MQTT_Anleitung.docx
@@ -33,6 +33,7 @@
       </w:pPr>
       <w:r>
         <w:rPr>
+          <w:i/>
           <w:color w:val="9A9CA0"/>
           <w:sz w:val="20"/>
         </w:rPr>
@@ -67,19 +68,7 @@
           <w:b w:val="0"/>
           <w:sz w:val="20"/>
         </w:rPr>
-        <w:t>Der Plattenwechsler stellt eine vollständige MQTT-Schnittstelle bereit. Über jede MQTT-fähige App (z. B. MQTT Client Lite, MQTT Explorer, IoT MQTT Panel) können Plattenwechsel ausgelöst, Fehler quittiert und Systemzustände in Echtzeit abgelesen werden. Eine eigene Web-Oberfläche ist nicht erforderlich.</w:t>
-      </w:r>
-    </w:p>
-    <w:p>
-      <w:pPr>
-        <w:spacing w:before="0" w:after="120"/>
-      </w:pPr>
-      <w:r>
-        <w:rPr>
-          <w:b w:val="0"/>
-          <w:sz w:val="20"/>
-        </w:rPr>
-        <w:t>Die Kommunikation läuft über einen Mosquitto-Broker, der direkt auf dem Raspberry Pi des Plattenwechslers läuft. Das Gerät und das Steuergerät (Smartphone, Tablet, PC) müssen sich im selben Netzwerk befinden.</w:t>
+        <w:t>Der Plattenwechsler ist über einen öffentlichen Cloud-MQTT-Broker erreichbar. Über jede MQTT-fähige App (z. B. MQTT Client Lite, MQTT Explorer) können Plattenwechsel ausgelöst, Fehler quittiert und Systemzustände in Echtzeit abgelesen werden — von überall, ohne VPN oder Netzwerkkonfiguration.</w:t>
       </w:r>
     </w:p>
     <w:p>
@@ -102,14 +91,13 @@
           <w:b w:val="0"/>
           <w:sz w:val="20"/>
         </w:rPr>
-        <w:t>Folgende Parameter in der MQTT-App eintragen:</w:t>
+        <w:t>Diese Daten in der MQTT-App eintragen:</w:t>
       </w:r>
     </w:p>
     <w:tbl>
       <w:tblPr>
         <w:tblStyle w:val="TableGrid"/>
         <w:tblW w:type="auto" w:w="0"/>
-        <w:jc w:val="left"/>
         <w:tblLook w:firstColumn="1" w:firstRow="1" w:lastColumn="0" w:lastRow="0" w:noHBand="0" w:noVBand="1" w:val="04A0"/>
       </w:tblPr>
       <w:tblGrid>
@@ -143,7 +131,7 @@
                 <w:rFonts w:ascii="Courier New" w:hAnsi="Courier New"/>
                 <w:sz w:val="18"/>
               </w:rPr>
-              <w:t>IP-Adresse des Raspberry Pi, z. B.  192.168.1.100</w:t>
+              <w:t>broker.hivemq.com</w:t>
             </w:r>
           </w:p>
         </w:tc>
@@ -175,7 +163,7 @@
                 <w:rFonts w:ascii="Courier New" w:hAnsi="Courier New"/>
                 <w:sz w:val="18"/>
               </w:rPr>
-              <w:t>1883  (Standard, kein TLS)</w:t>
+              <w:t>1883</w:t>
             </w:r>
           </w:p>
         </w:tc>
@@ -207,7 +195,7 @@
                 <w:rFonts w:ascii="Courier New" w:hAnsi="Courier New"/>
                 <w:sz w:val="18"/>
               </w:rPr>
-              <w:t>Beliebig, z. B.  mein-handy  (muss pro Gerät eindeutig sein)</w:t>
+              <w:t>Beliebig, z. B.  mein-handy  (pro Gerät eindeutig)</w:t>
             </w:r>
           </w:p>
         </w:tc>
@@ -239,7 +227,7 @@
                 <w:rFonts w:ascii="Courier New" w:hAnsi="Courier New"/>
                 <w:sz w:val="18"/>
               </w:rPr>
-              <w:t>Leer lassen (sofern in config.yaml nicht gesetzt)</w:t>
+              <w:t>Leer lassen</w:t>
             </w:r>
           </w:p>
         </w:tc>
@@ -271,39 +259,7 @@
                 <w:rFonts w:ascii="Courier New" w:hAnsi="Courier New"/>
                 <w:sz w:val="18"/>
               </w:rPr>
-              <w:t>Leer lassen (sofern in config.yaml nicht gesetzt)</w:t>
-            </w:r>
-          </w:p>
-        </w:tc>
-      </w:tr>
-      <w:tr>
-        <w:tc>
-          <w:tcPr>
-            <w:tcW w:type="dxa" w:w="2835"/>
-            <w:shd w:val="clear" w:color="auto" w:fill="FFFFFF"/>
-          </w:tcPr>
-          <w:p>
-            <w:r>
-              <w:rPr>
-                <w:b/>
-                <w:sz w:val="18"/>
-              </w:rPr>
-              <w:t>QoS</w:t>
-            </w:r>
-          </w:p>
-        </w:tc>
-        <w:tc>
-          <w:tcPr>
-            <w:tcW w:type="dxa" w:w="7087"/>
-            <w:shd w:val="clear" w:color="auto" w:fill="FFFFFF"/>
-          </w:tcPr>
-          <w:p>
-            <w:r>
-              <w:rPr>
-                <w:rFonts w:ascii="Courier New" w:hAnsi="Courier New"/>
-                <w:sz w:val="18"/>
-              </w:rPr>
-              <w:t>1  (mindestens einmal, empfohlen)</w:t>
+              <w:t>Leer lassen</w:t>
             </w:r>
           </w:p>
         </w:tc>
@@ -325,7 +281,7 @@
           <w:color w:val="3478F6"/>
           <w:sz w:val="18"/>
         </w:rPr>
-        <w:t>ℹ  Die IP-Adresse des Pi kann im Router-Interface oder per "hostname -I" im Terminal nachgeschlagen werden.</w:t>
+        <w:t>ℹ  Der Broker broker.hivemq.com ist ein öffentlicher Testbroker — kein Account erforderlich, funktioniert weltweit.</w:t>
       </w:r>
     </w:p>
     <w:p>
@@ -337,18 +293,6 @@
           <w:color w:val="C8102E"/>
         </w:rPr>
         <w:t>3  App-Einrichtung (MQTT Client Lite)</w:t>
-      </w:r>
-    </w:p>
-    <w:p>
-      <w:pPr>
-        <w:spacing w:before="0" w:after="120"/>
-      </w:pPr>
-      <w:r>
-        <w:rPr>
-          <w:b w:val="0"/>
-          <w:sz w:val="20"/>
-        </w:rPr>
-        <w:t>MQTT Client Lite (iOS/Android) erlaubt das Abonnieren von Topics (Empfangen) und das manuelle Senden von Nachrichten (Publizieren). Folgende Schritte sind einmalig nötig:</w:t>
       </w:r>
     </w:p>
     <w:p>
@@ -367,7 +311,7 @@
         <w:rPr>
           <w:sz w:val="20"/>
         </w:rPr>
-        <w:t>In der App unter "Connections" → "Add" die Verbindungsdaten aus Kapitel 2 eingeben und speichern.</w:t>
+        <w:t>In der App unter "Connections" → "Add" die Daten aus Kapitel 2 eintragen: Host = broker.hivemq.com, Port = 1883.</w:t>
       </w:r>
     </w:p>
     <w:p>
@@ -386,7 +330,7 @@
         <w:rPr>
           <w:sz w:val="20"/>
         </w:rPr>
-        <w:t>Unter "Subscriptions" → "Add" das Topic  plattenwechsler/#  eintragen. Das Rauten-Zeichen (Wildcard) empfängt alle Nachrichten des Systems auf einen Schlag.</w:t>
+        <w:t>Unter "Subscriptions" → "Add" das Topic  plattenwechsler-g6twie23a/#  eintragen. Das # empfängt alle Nachrichten des Systems auf einmal.</w:t>
       </w:r>
     </w:p>
     <w:p>
@@ -424,7 +368,7 @@
         <w:rPr>
           <w:sz w:val="20"/>
         </w:rPr>
-        <w:t>Nach jedem gesendeten Befehl erscheint innerhalb weniger Millisekunden eine Antwort auf  plattenwechsler/response.</w:t>
+        <w:t>Nach jedem gesendeten Befehl erscheint eine Antwort auf  plattenwechsler-g6twie23a/response.</w:t>
       </w:r>
     </w:p>
     <w:p>
@@ -447,7 +391,7 @@
           <w:b w:val="0"/>
           <w:sz w:val="20"/>
         </w:rPr>
-        <w:t>Diese Topics veröffentlicht der Plattenwechsler selbständig. Status-Topics werden alle 2 Sekunden aktualisiert und als "retained" gespeichert — d. h. beim Verbinden empfängt die App sofort den letzten Wert.</w:t>
+        <w:t>Diese Topics veröffentlicht der Plattenwechsler selbständig alle 2 Sekunden. Sie sind "retained" — beim Verbinden empfängt die App sofort den letzten Wert.</w:t>
       </w:r>
     </w:p>
     <w:p>
@@ -478,8 +422,8 @@
       <w:tr>
         <w:tc>
           <w:tcPr>
-            <w:tcW w:type="dxa" w:w="4252"/>
-            <w:shd w:val="clear" w:color="auto" w:fill="1F2024"/>
+            <w:tcW w:type="dxa" w:w="4819"/>
+            <w:shd w:val="clear" w:color="auto" w:fill="C8102E"/>
           </w:tcPr>
           <w:p>
             <w:r>
@@ -494,8 +438,8 @@
         </w:tc>
         <w:tc>
           <w:tcPr>
-            <w:tcW w:type="dxa" w:w="1417"/>
-            <w:shd w:val="clear" w:color="auto" w:fill="1F2024"/>
+            <w:tcW w:type="dxa" w:w="1134"/>
+            <w:shd w:val="clear" w:color="auto" w:fill="C8102E"/>
           </w:tcPr>
           <w:p>
             <w:r>
@@ -510,8 +454,8 @@
         </w:tc>
         <w:tc>
           <w:tcPr>
-            <w:tcW w:type="dxa" w:w="4252"/>
-            <w:shd w:val="clear" w:color="auto" w:fill="1F2024"/>
+            <w:tcW w:type="dxa" w:w="3969"/>
+            <w:shd w:val="clear" w:color="auto" w:fill="C8102E"/>
           </w:tcPr>
           <w:p>
             <w:r>
@@ -528,30 +472,28 @@
       <w:tr>
         <w:tc>
           <w:tcPr>
-            <w:tcW w:type="dxa" w:w="4252"/>
+            <w:tcW w:type="dxa" w:w="4819"/>
             <w:shd w:val="clear" w:color="auto" w:fill="F5F5F5"/>
           </w:tcPr>
           <w:p>
             <w:r>
               <w:rPr>
                 <w:rFonts w:ascii="Courier New" w:hAnsi="Courier New"/>
-                <w:b/>
                 <w:sz w:val="17"/>
               </w:rPr>
-              <w:t>plattenwechsler/status/online</w:t>
+              <w:t>plattenwechsler-g6twie23a/status/online</w:t>
             </w:r>
           </w:p>
         </w:tc>
         <w:tc>
           <w:tcPr>
-            <w:tcW w:type="dxa" w:w="1417"/>
+            <w:tcW w:type="dxa" w:w="1134"/>
             <w:shd w:val="clear" w:color="auto" w:fill="F5F5F5"/>
           </w:tcPr>
           <w:p>
             <w:r>
               <w:rPr>
-                <w:b w:val="0"/>
-                <w:sz w:val="17"/>
+                <w:sz w:val="18"/>
               </w:rPr>
               <w:t>String</w:t>
             </w:r>
@@ -559,16 +501,15 @@
         </w:tc>
         <w:tc>
           <w:tcPr>
-            <w:tcW w:type="dxa" w:w="4252"/>
+            <w:tcW w:type="dxa" w:w="3969"/>
             <w:shd w:val="clear" w:color="auto" w:fill="F5F5F5"/>
           </w:tcPr>
           <w:p>
             <w:r>
               <w:rPr>
-                <w:b w:val="0"/>
                 <w:sz w:val="18"/>
               </w:rPr>
-              <w:t>"online" wenn Pi verbunden, "offline" nach Trennung (Last Will)</w:t>
+              <w:t>"online" / "offline"</w:t>
             </w:r>
           </w:p>
         </w:tc>
@@ -576,30 +517,28 @@
       <w:tr>
         <w:tc>
           <w:tcPr>
-            <w:tcW w:type="dxa" w:w="4252"/>
+            <w:tcW w:type="dxa" w:w="4819"/>
             <w:shd w:val="clear" w:color="auto" w:fill="FFFFFF"/>
           </w:tcPr>
           <w:p>
             <w:r>
               <w:rPr>
                 <w:rFonts w:ascii="Courier New" w:hAnsi="Courier New"/>
-                <w:b/>
                 <w:sz w:val="17"/>
               </w:rPr>
-              <w:t>plattenwechsler/status/system</w:t>
+              <w:t>plattenwechsler-g6twie23a/status/system</w:t>
             </w:r>
           </w:p>
         </w:tc>
         <w:tc>
           <w:tcPr>
-            <w:tcW w:type="dxa" w:w="1417"/>
+            <w:tcW w:type="dxa" w:w="1134"/>
             <w:shd w:val="clear" w:color="auto" w:fill="FFFFFF"/>
           </w:tcPr>
           <w:p>
             <w:r>
               <w:rPr>
-                <w:b w:val="0"/>
-                <w:sz w:val="17"/>
+                <w:sz w:val="18"/>
               </w:rPr>
               <w:t>JSON</w:t>
             </w:r>
@@ -607,16 +546,15 @@
         </w:tc>
         <w:tc>
           <w:tcPr>
-            <w:tcW w:type="dxa" w:w="4252"/>
+            <w:tcW w:type="dxa" w:w="3969"/>
             <w:shd w:val="clear" w:color="auto" w:fill="FFFFFF"/>
           </w:tcPr>
           <w:p>
             <w:r>
               <w:rPr>
-                <w:b w:val="0"/>
                 <w:sz w:val="18"/>
               </w:rPr>
-              <w:t>Vollständiger System-Snapshot (→ Kapitel 6.1)</w:t>
+              <w:t>Vollständiger System-Snapshot (→ Kap. 6.1)</w:t>
             </w:r>
           </w:p>
         </w:tc>
@@ -624,30 +562,28 @@
       <w:tr>
         <w:tc>
           <w:tcPr>
-            <w:tcW w:type="dxa" w:w="4252"/>
+            <w:tcW w:type="dxa" w:w="4819"/>
             <w:shd w:val="clear" w:color="auto" w:fill="F5F5F5"/>
           </w:tcPr>
           <w:p>
             <w:r>
               <w:rPr>
                 <w:rFonts w:ascii="Courier New" w:hAnsi="Courier New"/>
-                <w:b/>
                 <w:sz w:val="17"/>
               </w:rPr>
-              <w:t>plattenwechsler/status/esp</w:t>
+              <w:t>plattenwechsler-g6twie23a/status/esp</w:t>
             </w:r>
           </w:p>
         </w:tc>
         <w:tc>
           <w:tcPr>
-            <w:tcW w:type="dxa" w:w="1417"/>
+            <w:tcW w:type="dxa" w:w="1134"/>
             <w:shd w:val="clear" w:color="auto" w:fill="F5F5F5"/>
           </w:tcPr>
           <w:p>
             <w:r>
               <w:rPr>
-                <w:b w:val="0"/>
-                <w:sz w:val="17"/>
+                <w:sz w:val="18"/>
               </w:rPr>
               <w:t>JSON</w:t>
             </w:r>
@@ -655,16 +591,15 @@
         </w:tc>
         <w:tc>
           <w:tcPr>
-            <w:tcW w:type="dxa" w:w="4252"/>
+            <w:tcW w:type="dxa" w:w="3969"/>
             <w:shd w:val="clear" w:color="auto" w:fill="F5F5F5"/>
           </w:tcPr>
           <w:p>
             <w:r>
               <w:rPr>
-                <w:b w:val="0"/>
                 <w:sz w:val="18"/>
               </w:rPr>
-              <w:t>ESP-Zustand: Position, Sensoren, Referenzierung (→ Kapitel 6.2)</w:t>
+              <w:t>ESP-Zustand: Position, Sensoren (→ Kap. 6.2)</w:t>
             </w:r>
           </w:p>
         </w:tc>
@@ -672,30 +607,28 @@
       <w:tr>
         <w:tc>
           <w:tcPr>
-            <w:tcW w:type="dxa" w:w="4252"/>
+            <w:tcW w:type="dxa" w:w="4819"/>
             <w:shd w:val="clear" w:color="auto" w:fill="FFFFFF"/>
           </w:tcPr>
           <w:p>
             <w:r>
               <w:rPr>
                 <w:rFonts w:ascii="Courier New" w:hAnsi="Courier New"/>
-                <w:b/>
                 <w:sz w:val="17"/>
               </w:rPr>
-              <w:t>plattenwechsler/status/drucker/1</w:t>
+              <w:t>plattenwechsler-g6twie23a/status/drucker/1</w:t>
             </w:r>
           </w:p>
         </w:tc>
         <w:tc>
           <w:tcPr>
-            <w:tcW w:type="dxa" w:w="1417"/>
+            <w:tcW w:type="dxa" w:w="1134"/>
             <w:shd w:val="clear" w:color="auto" w:fill="FFFFFF"/>
           </w:tcPr>
           <w:p>
             <w:r>
               <w:rPr>
-                <w:b w:val="0"/>
-                <w:sz w:val="17"/>
+                <w:sz w:val="18"/>
               </w:rPr>
               <w:t>JSON</w:t>
             </w:r>
@@ -703,64 +636,15 @@
         </w:tc>
         <w:tc>
           <w:tcPr>
-            <w:tcW w:type="dxa" w:w="4252"/>
+            <w:tcW w:type="dxa" w:w="3969"/>
             <w:shd w:val="clear" w:color="auto" w:fill="FFFFFF"/>
           </w:tcPr>
           <w:p>
             <w:r>
               <w:rPr>
-                <w:b w:val="0"/>
                 <w:sz w:val="18"/>
               </w:rPr>
-              <w:t>Status Drucker 1: {"drucker_id": 1, "status": "bereit"}</w:t>
-            </w:r>
-          </w:p>
-        </w:tc>
-      </w:tr>
-      <w:tr>
-        <w:tc>
-          <w:tcPr>
-            <w:tcW w:type="dxa" w:w="4252"/>
-            <w:shd w:val="clear" w:color="auto" w:fill="F5F5F5"/>
-          </w:tcPr>
-          <w:p>
-            <w:r>
-              <w:rPr>
-                <w:rFonts w:ascii="Courier New" w:hAnsi="Courier New"/>
-                <w:b/>
-                <w:sz w:val="17"/>
-              </w:rPr>
-              <w:t>plattenwechsler/status/drucker/2</w:t>
-            </w:r>
-          </w:p>
-        </w:tc>
-        <w:tc>
-          <w:tcPr>
-            <w:tcW w:type="dxa" w:w="1417"/>
-            <w:shd w:val="clear" w:color="auto" w:fill="F5F5F5"/>
-          </w:tcPr>
-          <w:p>
-            <w:r>
-              <w:rPr>
-                <w:b w:val="0"/>
-                <w:sz w:val="17"/>
-              </w:rPr>
-              <w:t>JSON</w:t>
-            </w:r>
-          </w:p>
-        </w:tc>
-        <w:tc>
-          <w:tcPr>
-            <w:tcW w:type="dxa" w:w="4252"/>
-            <w:shd w:val="clear" w:color="auto" w:fill="F5F5F5"/>
-          </w:tcPr>
-          <w:p>
-            <w:r>
-              <w:rPr>
-                <w:b w:val="0"/>
-                <w:sz w:val="18"/>
-              </w:rPr>
-              <w:t>Status Drucker 2 (analog für alle konfigurierten Drucker)</w:t>
+              <w:t>Status Drucker 1 — analog für alle Drucker</w:t>
             </w:r>
           </w:p>
         </w:tc>
@@ -794,8 +678,8 @@
       <w:tr>
         <w:tc>
           <w:tcPr>
-            <w:tcW w:type="dxa" w:w="4252"/>
-            <w:shd w:val="clear" w:color="auto" w:fill="1F2024"/>
+            <w:tcW w:type="dxa" w:w="4819"/>
+            <w:shd w:val="clear" w:color="auto" w:fill="C8102E"/>
           </w:tcPr>
           <w:p>
             <w:r>
@@ -810,8 +694,8 @@
         </w:tc>
         <w:tc>
           <w:tcPr>
-            <w:tcW w:type="dxa" w:w="1417"/>
-            <w:shd w:val="clear" w:color="auto" w:fill="1F2024"/>
+            <w:tcW w:type="dxa" w:w="1134"/>
+            <w:shd w:val="clear" w:color="auto" w:fill="C8102E"/>
           </w:tcPr>
           <w:p>
             <w:r>
@@ -826,8 +710,8 @@
         </w:tc>
         <w:tc>
           <w:tcPr>
-            <w:tcW w:type="dxa" w:w="4252"/>
-            <w:shd w:val="clear" w:color="auto" w:fill="1F2024"/>
+            <w:tcW w:type="dxa" w:w="3969"/>
+            <w:shd w:val="clear" w:color="auto" w:fill="C8102E"/>
           </w:tcPr>
           <w:p>
             <w:r>
@@ -844,30 +728,28 @@
       <w:tr>
         <w:tc>
           <w:tcPr>
-            <w:tcW w:type="dxa" w:w="4252"/>
+            <w:tcW w:type="dxa" w:w="4819"/>
             <w:shd w:val="clear" w:color="auto" w:fill="F5F5F5"/>
           </w:tcPr>
           <w:p>
             <w:r>
               <w:rPr>
                 <w:rFonts w:ascii="Courier New" w:hAnsi="Courier New"/>
-                <w:b/>
                 <w:sz w:val="17"/>
               </w:rPr>
-              <w:t>plattenwechsler/error</w:t>
+              <w:t>plattenwechsler-g6twie23a/error</w:t>
             </w:r>
           </w:p>
         </w:tc>
         <w:tc>
           <w:tcPr>
-            <w:tcW w:type="dxa" w:w="1417"/>
+            <w:tcW w:type="dxa" w:w="1134"/>
             <w:shd w:val="clear" w:color="auto" w:fill="F5F5F5"/>
           </w:tcPr>
           <w:p>
             <w:r>
               <w:rPr>
-                <w:b w:val="0"/>
-                <w:sz w:val="17"/>
+                <w:sz w:val="18"/>
               </w:rPr>
               <w:t>JSON</w:t>
             </w:r>
@@ -875,16 +757,15 @@
         </w:tc>
         <w:tc>
           <w:tcPr>
-            <w:tcW w:type="dxa" w:w="4252"/>
+            <w:tcW w:type="dxa" w:w="3969"/>
             <w:shd w:val="clear" w:color="auto" w:fill="F5F5F5"/>
           </w:tcPr>
           <w:p>
             <w:r>
               <w:rPr>
-                <w:b w:val="0"/>
                 <w:sz w:val="18"/>
               </w:rPr>
-              <w:t>Wird bei jedem neuen Fehler veröffentlicht (→ Kapitel 6.3)</w:t>
+              <w:t>Wird bei jedem neuen Fehler veröffentlicht (→ Kap. 6.3)</w:t>
             </w:r>
           </w:p>
         </w:tc>
@@ -892,30 +773,28 @@
       <w:tr>
         <w:tc>
           <w:tcPr>
-            <w:tcW w:type="dxa" w:w="4252"/>
+            <w:tcW w:type="dxa" w:w="4819"/>
             <w:shd w:val="clear" w:color="auto" w:fill="FFFFFF"/>
           </w:tcPr>
           <w:p>
             <w:r>
               <w:rPr>
                 <w:rFonts w:ascii="Courier New" w:hAnsi="Courier New"/>
-                <w:b/>
                 <w:sz w:val="17"/>
               </w:rPr>
-              <w:t>plattenwechsler/event/auftrag</w:t>
+              <w:t>plattenwechsler-g6twie23a/event/auftrag</w:t>
             </w:r>
           </w:p>
         </w:tc>
         <w:tc>
           <w:tcPr>
-            <w:tcW w:type="dxa" w:w="1417"/>
+            <w:tcW w:type="dxa" w:w="1134"/>
             <w:shd w:val="clear" w:color="auto" w:fill="FFFFFF"/>
           </w:tcPr>
           <w:p>
             <w:r>
               <w:rPr>
-                <w:b w:val="0"/>
-                <w:sz w:val="17"/>
+                <w:sz w:val="18"/>
               </w:rPr>
               <w:t>JSON</w:t>
             </w:r>
@@ -923,16 +802,15 @@
         </w:tc>
         <w:tc>
           <w:tcPr>
-            <w:tcW w:type="dxa" w:w="4252"/>
+            <w:tcW w:type="dxa" w:w="3969"/>
             <w:shd w:val="clear" w:color="auto" w:fill="FFFFFF"/>
           </w:tcPr>
           <w:p>
             <w:r>
               <w:rPr>
-                <w:b w:val="0"/>
                 <w:sz w:val="18"/>
               </w:rPr>
-              <w:t>Wird nach erfolgreichem Plattenwechsel veröffentlicht (→ Kapitel 6.4)</w:t>
+              <w:t>Wird nach erfolgreichem Plattenwechsel veröffentlicht (→ Kap. 6.4)</w:t>
             </w:r>
           </w:p>
         </w:tc>
@@ -940,30 +818,28 @@
       <w:tr>
         <w:tc>
           <w:tcPr>
-            <w:tcW w:type="dxa" w:w="4252"/>
+            <w:tcW w:type="dxa" w:w="4819"/>
             <w:shd w:val="clear" w:color="auto" w:fill="F5F5F5"/>
           </w:tcPr>
           <w:p>
             <w:r>
               <w:rPr>
                 <w:rFonts w:ascii="Courier New" w:hAnsi="Courier New"/>
-                <w:b/>
                 <w:sz w:val="17"/>
               </w:rPr>
-              <w:t>plattenwechsler/response</w:t>
+              <w:t>plattenwechsler-g6twie23a/response</w:t>
             </w:r>
           </w:p>
         </w:tc>
         <w:tc>
           <w:tcPr>
-            <w:tcW w:type="dxa" w:w="1417"/>
+            <w:tcW w:type="dxa" w:w="1134"/>
             <w:shd w:val="clear" w:color="auto" w:fill="F5F5F5"/>
           </w:tcPr>
           <w:p>
             <w:r>
               <w:rPr>
-                <w:b w:val="0"/>
-                <w:sz w:val="17"/>
+                <w:sz w:val="18"/>
               </w:rPr>
               <w:t>JSON</w:t>
             </w:r>
@@ -971,35 +847,20 @@
         </w:tc>
         <w:tc>
           <w:tcPr>
-            <w:tcW w:type="dxa" w:w="4252"/>
+            <w:tcW w:type="dxa" w:w="3969"/>
             <w:shd w:val="clear" w:color="auto" w:fill="F5F5F5"/>
           </w:tcPr>
           <w:p>
             <w:r>
               <w:rPr>
-                <w:b w:val="0"/>
                 <w:sz w:val="18"/>
               </w:rPr>
-              <w:t>Antwort auf jeden gesendeten Befehl (→ Kapitel 6.5)</w:t>
+              <w:t>Antwort auf jeden gesendeten Befehl (→ Kap. 6.5)</w:t>
             </w:r>
           </w:p>
         </w:tc>
       </w:tr>
     </w:tbl>
-    <w:p>
-      <w:pPr>
-        <w:spacing w:before="40" w:after="120"/>
-        <w:ind w:left="283"/>
-      </w:pPr>
-      <w:r>
-        <w:rPr>
-          <w:i/>
-          <w:color w:val="9A9CA0"/>
-          <w:sz w:val="18"/>
-        </w:rPr>
-        <w:t>ℹ  Für den einfachsten Einstieg genügt das Abonnieren von  plattenwechsler/#  — damit empfängt man alle oben genannten Topics gleichzeitig.</w:t>
-      </w:r>
-    </w:p>
     <w:p>
       <w:pPr>
         <w:pStyle w:val="Heading1"/>
@@ -1020,7 +881,7 @@
           <w:b w:val="0"/>
           <w:sz w:val="20"/>
         </w:rPr>
-        <w:t>Befehle werden an das System gesendet, indem man auf das entsprechende Topic publiziert. Der Payload ist immer UTF-8-kodiertes JSON. Für Befehle ohne Parameter kann ein leerer String oder  {}  gesendet werden. Retain beim Senden auf  false  lassen.</w:t>
+        <w:t>Befehle werden durch Publizieren auf das jeweilige Topic gesendet. Payload ist immer JSON. Retain beim Senden auf  false  lassen.</w:t>
       </w:r>
     </w:p>
     <w:p>
@@ -1051,7 +912,7 @@
       <w:tr>
         <w:tc>
           <w:tcPr>
-            <w:tcW w:type="dxa" w:w="3969"/>
+            <w:tcW w:type="dxa" w:w="4252"/>
             <w:shd w:val="clear" w:color="auto" w:fill="C8102E"/>
           </w:tcPr>
           <w:p>
@@ -1067,7 +928,7 @@
         </w:tc>
         <w:tc>
           <w:tcPr>
-            <w:tcW w:type="dxa" w:w="2835"/>
+            <w:tcW w:type="dxa" w:w="2551"/>
             <w:shd w:val="clear" w:color="auto" w:fill="C8102E"/>
           </w:tcPr>
           <w:p>
@@ -1101,33 +962,31 @@
       <w:tr>
         <w:tc>
           <w:tcPr>
-            <w:tcW w:type="dxa" w:w="3969"/>
+            <w:tcW w:type="dxa" w:w="4252"/>
             <w:shd w:val="clear" w:color="auto" w:fill="F5F5F5"/>
           </w:tcPr>
           <w:p>
             <w:r>
               <w:rPr>
                 <w:rFonts w:ascii="Courier New" w:hAnsi="Courier New"/>
-                <w:b/>
                 <w:sz w:val="17"/>
               </w:rPr>
-              <w:t>plattenwechsler/cmd/auftrag</w:t>
+              <w:t>plattenwechsler-g6twie23a/cmd/auftrag</w:t>
             </w:r>
           </w:p>
         </w:tc>
         <w:tc>
           <w:tcPr>
-            <w:tcW w:type="dxa" w:w="2835"/>
+            <w:tcW w:type="dxa" w:w="2551"/>
             <w:shd w:val="clear" w:color="auto" w:fill="F5F5F5"/>
           </w:tcPr>
           <w:p>
             <w:r>
               <w:rPr>
                 <w:rFonts w:ascii="Courier New" w:hAnsi="Courier New"/>
-                <w:b w:val="0"/>
                 <w:sz w:val="17"/>
               </w:rPr>
-              <w:t>{"drucker_id": 2}</w:t>
+              <w:t>{"drucker_id": 1}</w:t>
             </w:r>
           </w:p>
         </w:tc>
@@ -1139,10 +998,9 @@
           <w:p>
             <w:r>
               <w:rPr>
-                <w:b w:val="0"/>
                 <w:sz w:val="18"/>
               </w:rPr>
-              <w:t>Plattenwechsel für Drucker 2 anfordern. Wird in die Warteschlange eingereiht.</w:t>
+              <w:t>Plattenwechsel für Drucker 1 anfordern</w:t>
             </w:r>
           </w:p>
         </w:tc>
@@ -1150,30 +1008,28 @@
       <w:tr>
         <w:tc>
           <w:tcPr>
-            <w:tcW w:type="dxa" w:w="3969"/>
+            <w:tcW w:type="dxa" w:w="4252"/>
             <w:shd w:val="clear" w:color="auto" w:fill="FFFFFF"/>
           </w:tcPr>
           <w:p>
             <w:r>
               <w:rPr>
                 <w:rFonts w:ascii="Courier New" w:hAnsi="Courier New"/>
-                <w:b/>
                 <w:sz w:val="17"/>
               </w:rPr>
-              <w:t>plattenwechsler/cmd/quittieren</w:t>
+              <w:t>plattenwechsler-g6twie23a/cmd/quittieren</w:t>
             </w:r>
           </w:p>
         </w:tc>
         <w:tc>
           <w:tcPr>
-            <w:tcW w:type="dxa" w:w="2835"/>
+            <w:tcW w:type="dxa" w:w="2551"/>
             <w:shd w:val="clear" w:color="auto" w:fill="FFFFFF"/>
           </w:tcPr>
           <w:p>
             <w:r>
               <w:rPr>
                 <w:rFonts w:ascii="Courier New" w:hAnsi="Courier New"/>
-                <w:b w:val="0"/>
                 <w:sz w:val="17"/>
               </w:rPr>
               <w:t>{}</w:t>
@@ -1188,10 +1044,9 @@
           <w:p>
             <w:r>
               <w:rPr>
-                <w:b w:val="0"/>
                 <w:sz w:val="18"/>
               </w:rPr>
-              <w:t>Aktiven Fehler quittieren und System in Bereitschaft zurücksetzen.</w:t>
+              <w:t>Aktiven Fehler quittieren</w:t>
             </w:r>
           </w:p>
         </w:tc>
@@ -1199,30 +1054,28 @@
       <w:tr>
         <w:tc>
           <w:tcPr>
-            <w:tcW w:type="dxa" w:w="3969"/>
+            <w:tcW w:type="dxa" w:w="4252"/>
             <w:shd w:val="clear" w:color="auto" w:fill="F5F5F5"/>
           </w:tcPr>
           <w:p>
             <w:r>
               <w:rPr>
                 <w:rFonts w:ascii="Courier New" w:hAnsi="Courier New"/>
-                <w:b/>
                 <w:sz w:val="17"/>
               </w:rPr>
-              <w:t>plattenwechsler/cmd/stop</w:t>
+              <w:t>plattenwechsler-g6twie23a/cmd/stop</w:t>
             </w:r>
           </w:p>
         </w:tc>
         <w:tc>
           <w:tcPr>
-            <w:tcW w:type="dxa" w:w="2835"/>
+            <w:tcW w:type="dxa" w:w="2551"/>
             <w:shd w:val="clear" w:color="auto" w:fill="F5F5F5"/>
           </w:tcPr>
           <w:p>
             <w:r>
               <w:rPr>
                 <w:rFonts w:ascii="Courier New" w:hAnsi="Courier New"/>
-                <w:b w:val="0"/>
                 <w:sz w:val="17"/>
               </w:rPr>
               <w:t>{}</w:t>
@@ -1237,10 +1090,9 @@
           <w:p>
             <w:r>
               <w:rPr>
-                <w:b w:val="0"/>
                 <w:sz w:val="18"/>
               </w:rPr>
-              <w:t>Motoren sofort stoppen (Not-Halt). System wechselt in Fehlerzustand.</w:t>
+              <w:t>Motoren sofort stoppen (Not-Halt)</w:t>
             </w:r>
           </w:p>
         </w:tc>
@@ -1248,30 +1100,28 @@
       <w:tr>
         <w:tc>
           <w:tcPr>
-            <w:tcW w:type="dxa" w:w="3969"/>
+            <w:tcW w:type="dxa" w:w="4252"/>
             <w:shd w:val="clear" w:color="auto" w:fill="FFFFFF"/>
           </w:tcPr>
           <w:p>
             <w:r>
               <w:rPr>
                 <w:rFonts w:ascii="Courier New" w:hAnsi="Courier New"/>
-                <w:b/>
                 <w:sz w:val="17"/>
               </w:rPr>
-              <w:t>plattenwechsler/cmd/referenzfahrt</w:t>
+              <w:t>plattenwechsler-g6twie23a/cmd/referenzfahrt</w:t>
             </w:r>
           </w:p>
         </w:tc>
         <w:tc>
           <w:tcPr>
-            <w:tcW w:type="dxa" w:w="2835"/>
+            <w:tcW w:type="dxa" w:w="2551"/>
             <w:shd w:val="clear" w:color="auto" w:fill="FFFFFF"/>
           </w:tcPr>
           <w:p>
             <w:r>
               <w:rPr>
                 <w:rFonts w:ascii="Courier New" w:hAnsi="Courier New"/>
-                <w:b w:val="0"/>
                 <w:sz w:val="17"/>
               </w:rPr>
               <w:t>{}</w:t>
@@ -1286,10 +1136,9 @@
           <w:p>
             <w:r>
               <w:rPr>
-                <w:b w:val="0"/>
                 <w:sz w:val="18"/>
               </w:rPr>
-              <w:t>Manuelle Referenzfahrt starten (Endschalter anfahren, Position nullen).</w:t>
+              <w:t>Manuelle Referenzfahrt starten</w:t>
             </w:r>
           </w:p>
         </w:tc>
@@ -1297,30 +1146,28 @@
       <w:tr>
         <w:tc>
           <w:tcPr>
-            <w:tcW w:type="dxa" w:w="3969"/>
+            <w:tcW w:type="dxa" w:w="4252"/>
             <w:shd w:val="clear" w:color="auto" w:fill="F5F5F5"/>
           </w:tcPr>
           <w:p>
             <w:r>
               <w:rPr>
                 <w:rFonts w:ascii="Courier New" w:hAnsi="Courier New"/>
-                <w:b/>
                 <w:sz w:val="17"/>
               </w:rPr>
-              <w:t>plattenwechsler/cmd/status_request</w:t>
+              <w:t>plattenwechsler-g6twie23a/cmd/status_request</w:t>
             </w:r>
           </w:p>
         </w:tc>
         <w:tc>
           <w:tcPr>
-            <w:tcW w:type="dxa" w:w="2835"/>
+            <w:tcW w:type="dxa" w:w="2551"/>
             <w:shd w:val="clear" w:color="auto" w:fill="F5F5F5"/>
           </w:tcPr>
           <w:p>
             <w:r>
               <w:rPr>
                 <w:rFonts w:ascii="Courier New" w:hAnsi="Courier New"/>
-                <w:b w:val="0"/>
                 <w:sz w:val="17"/>
               </w:rPr>
               <w:t>{}</w:t>
@@ -1335,10 +1182,9 @@
           <w:p>
             <w:r>
               <w:rPr>
-                <w:b w:val="0"/>
                 <w:sz w:val="18"/>
               </w:rPr>
-              <w:t>Sofortige Veröffentlichung des aktuellen Systemstatus erzwingen (ohne 2-Sek.-Verzögerung).</w:t>
+              <w:t>Sofortige Status-Veröffentlichung erzwingen</w:t>
             </w:r>
           </w:p>
         </w:tc>
@@ -1357,18 +1203,6 @@
         <w:t>SERVICE-BEFEHLE</w:t>
       </w:r>
     </w:p>
-    <w:p>
-      <w:pPr>
-        <w:spacing w:before="0" w:after="80"/>
-      </w:pPr>
-      <w:r>
-        <w:rPr>
-          <w:b w:val="0"/>
-          <w:sz w:val="18"/>
-        </w:rPr>
-        <w:t>Service-Befehle erlauben manuelle Schlittenbewegungen. Der Service-Modus muss zuerst aktiviert werden. Während des Service-Modus werden keine automatischen Plattenwechsel durchgeführt.</w:t>
-      </w:r>
-    </w:p>
     <w:tbl>
       <w:tblPr>
         <w:tblStyle w:val="TableGrid"/>
@@ -1384,7 +1218,7 @@
       <w:tr>
         <w:tc>
           <w:tcPr>
-            <w:tcW w:type="dxa" w:w="3969"/>
+            <w:tcW w:type="dxa" w:w="4252"/>
             <w:shd w:val="clear" w:color="auto" w:fill="C8102E"/>
           </w:tcPr>
           <w:p>
@@ -1400,7 +1234,7 @@
         </w:tc>
         <w:tc>
           <w:tcPr>
-            <w:tcW w:type="dxa" w:w="2835"/>
+            <w:tcW w:type="dxa" w:w="2551"/>
             <w:shd w:val="clear" w:color="auto" w:fill="C8102E"/>
           </w:tcPr>
           <w:p>
@@ -1434,30 +1268,28 @@
       <w:tr>
         <w:tc>
           <w:tcPr>
-            <w:tcW w:type="dxa" w:w="3969"/>
+            <w:tcW w:type="dxa" w:w="4252"/>
             <w:shd w:val="clear" w:color="auto" w:fill="F5F5F5"/>
           </w:tcPr>
           <w:p>
             <w:r>
               <w:rPr>
                 <w:rFonts w:ascii="Courier New" w:hAnsi="Courier New"/>
-                <w:b/>
                 <w:sz w:val="17"/>
               </w:rPr>
-              <w:t>plattenwechsler/cmd/service/modus</w:t>
+              <w:t>plattenwechsler-g6twie23a/cmd/service/modus</w:t>
             </w:r>
           </w:p>
         </w:tc>
         <w:tc>
           <w:tcPr>
-            <w:tcW w:type="dxa" w:w="2835"/>
+            <w:tcW w:type="dxa" w:w="2551"/>
             <w:shd w:val="clear" w:color="auto" w:fill="F5F5F5"/>
           </w:tcPr>
           <w:p>
             <w:r>
               <w:rPr>
                 <w:rFonts w:ascii="Courier New" w:hAnsi="Courier New"/>
-                <w:b w:val="0"/>
                 <w:sz w:val="17"/>
               </w:rPr>
               <w:t>{"aktiv": true}</w:t>
@@ -1472,10 +1304,9 @@
           <w:p>
             <w:r>
               <w:rPr>
-                <w:b w:val="0"/>
                 <w:sz w:val="18"/>
               </w:rPr>
-              <w:t>Service-Modus aktivieren. {"aktiv": false} zum Beenden.</w:t>
+              <w:t>Service-Modus aktivieren / beenden</w:t>
             </w:r>
           </w:p>
         </w:tc>
@@ -1483,30 +1314,28 @@
       <w:tr>
         <w:tc>
           <w:tcPr>
-            <w:tcW w:type="dxa" w:w="3969"/>
+            <w:tcW w:type="dxa" w:w="4252"/>
             <w:shd w:val="clear" w:color="auto" w:fill="FFFFFF"/>
           </w:tcPr>
           <w:p>
             <w:r>
               <w:rPr>
                 <w:rFonts w:ascii="Courier New" w:hAnsi="Courier New"/>
-                <w:b/>
                 <w:sz w:val="17"/>
               </w:rPr>
-              <w:t>plattenwechsler/cmd/service/fahre</w:t>
+              <w:t>plattenwechsler-g6twie23a/cmd/service/fahre</w:t>
             </w:r>
           </w:p>
         </w:tc>
         <w:tc>
           <w:tcPr>
-            <w:tcW w:type="dxa" w:w="2835"/>
+            <w:tcW w:type="dxa" w:w="2551"/>
             <w:shd w:val="clear" w:color="auto" w:fill="FFFFFF"/>
           </w:tcPr>
           <w:p>
             <w:r>
               <w:rPr>
                 <w:rFonts w:ascii="Courier New" w:hAnsi="Courier New"/>
-                <w:b w:val="0"/>
                 <w:sz w:val="17"/>
               </w:rPr>
               <w:t>{"ziel": "ablage"}</w:t>
@@ -1521,10 +1350,9 @@
           <w:p>
             <w:r>
               <w:rPr>
-                <w:b w:val="0"/>
                 <w:sz w:val="18"/>
               </w:rPr>
-              <w:t>Schlitten zu Sonderposition fahren. Werte: "home", "ablage", "magazin".</w:t>
+              <w:t>Schlitten zu Position fahren: home | ablage | magazin</w:t>
             </w:r>
           </w:p>
         </w:tc>
@@ -1532,30 +1360,28 @@
       <w:tr>
         <w:tc>
           <w:tcPr>
-            <w:tcW w:type="dxa" w:w="3969"/>
+            <w:tcW w:type="dxa" w:w="4252"/>
             <w:shd w:val="clear" w:color="auto" w:fill="F5F5F5"/>
           </w:tcPr>
           <w:p>
             <w:r>
               <w:rPr>
                 <w:rFonts w:ascii="Courier New" w:hAnsi="Courier New"/>
-                <w:b/>
                 <w:sz w:val="17"/>
               </w:rPr>
-              <w:t>plattenwechsler/cmd/service/drucker</w:t>
+              <w:t>plattenwechsler-g6twie23a/cmd/service/drucker</w:t>
             </w:r>
           </w:p>
         </w:tc>
         <w:tc>
           <w:tcPr>
-            <w:tcW w:type="dxa" w:w="2835"/>
+            <w:tcW w:type="dxa" w:w="2551"/>
             <w:shd w:val="clear" w:color="auto" w:fill="F5F5F5"/>
           </w:tcPr>
           <w:p>
             <w:r>
               <w:rPr>
                 <w:rFonts w:ascii="Courier New" w:hAnsi="Courier New"/>
-                <w:b w:val="0"/>
                 <w:sz w:val="17"/>
               </w:rPr>
               <w:t>{"drucker_id": 1}</w:t>
@@ -1570,10 +1396,9 @@
           <w:p>
             <w:r>
               <w:rPr>
-                <w:b w:val="0"/>
                 <w:sz w:val="18"/>
               </w:rPr>
-              <w:t>Schlitten zur X-Position von Drucker 1 fahren.</w:t>
+              <w:t>Schlitten zur X-Position von Drucker 1 fahren</w:t>
             </w:r>
           </w:p>
         </w:tc>
@@ -1589,19 +1414,7 @@
           <w:color w:val="9A9CA0"/>
           <w:sz w:val="16"/>
         </w:rPr>
-        <w:t>DRUCKER-KONFIGURATIONSBEFEHLE</w:t>
-      </w:r>
-    </w:p>
-    <w:p>
-      <w:pPr>
-        <w:spacing w:before="0" w:after="80"/>
-      </w:pPr>
-      <w:r>
-        <w:rPr>
-          <w:b w:val="0"/>
-          <w:sz w:val="18"/>
-        </w:rPr>
-        <w:t>Diese Befehle ändern die Konfiguration dauerhaft (config.yaml wird aktualisiert). Kein Neustart nötig.</w:t>
+        <w:t>DRUCKER-KONFIGURATION</w:t>
       </w:r>
     </w:p>
     <w:tbl>
@@ -1619,7 +1432,7 @@
       <w:tr>
         <w:tc>
           <w:tcPr>
-            <w:tcW w:type="dxa" w:w="3969"/>
+            <w:tcW w:type="dxa" w:w="4252"/>
             <w:shd w:val="clear" w:color="auto" w:fill="C8102E"/>
           </w:tcPr>
           <w:p>
@@ -1635,7 +1448,7 @@
         </w:tc>
         <w:tc>
           <w:tcPr>
-            <w:tcW w:type="dxa" w:w="2835"/>
+            <w:tcW w:type="dxa" w:w="2551"/>
             <w:shd w:val="clear" w:color="auto" w:fill="C8102E"/>
           </w:tcPr>
           <w:p>
@@ -1669,33 +1482,31 @@
       <w:tr>
         <w:tc>
           <w:tcPr>
-            <w:tcW w:type="dxa" w:w="3969"/>
+            <w:tcW w:type="dxa" w:w="4252"/>
             <w:shd w:val="clear" w:color="auto" w:fill="F5F5F5"/>
           </w:tcPr>
           <w:p>
             <w:r>
               <w:rPr>
                 <w:rFonts w:ascii="Courier New" w:hAnsi="Courier New"/>
-                <w:b/>
                 <w:sz w:val="17"/>
               </w:rPr>
-              <w:t>plattenwechsler/cmd/drucker/setzen</w:t>
+              <w:t>plattenwechsler-g6twie23a/cmd/drucker/setzen</w:t>
             </w:r>
           </w:p>
         </w:tc>
         <w:tc>
           <w:tcPr>
-            <w:tcW w:type="dxa" w:w="2835"/>
+            <w:tcW w:type="dxa" w:w="2551"/>
             <w:shd w:val="clear" w:color="auto" w:fill="F5F5F5"/>
           </w:tcPr>
           <w:p>
             <w:r>
               <w:rPr>
                 <w:rFonts w:ascii="Courier New" w:hAnsi="Courier New"/>
-                <w:b w:val="0"/>
                 <w:sz w:val="17"/>
               </w:rPr>
-              <w:t>{"id": 1, "name": "Drucker 1", "pos_x": 100, ...}</w:t>
+              <w:t>{"id": 1, "name": "...", ...}</w:t>
             </w:r>
           </w:p>
         </w:tc>
@@ -1707,10 +1518,9 @@
           <w:p>
             <w:r>
               <w:rPr>
-                <w:b w:val="0"/>
                 <w:sz w:val="18"/>
               </w:rPr>
-              <w:t>Drucker anlegen oder aktualisieren. Alle Felder → Kapitel 6.6.</w:t>
+              <w:t>Drucker anlegen oder aktualisieren (→ Kap. 6.6)</w:t>
             </w:r>
           </w:p>
         </w:tc>
@@ -1718,30 +1528,28 @@
       <w:tr>
         <w:tc>
           <w:tcPr>
-            <w:tcW w:type="dxa" w:w="3969"/>
+            <w:tcW w:type="dxa" w:w="4252"/>
             <w:shd w:val="clear" w:color="auto" w:fill="FFFFFF"/>
           </w:tcPr>
           <w:p>
             <w:r>
               <w:rPr>
                 <w:rFonts w:ascii="Courier New" w:hAnsi="Courier New"/>
-                <w:b/>
                 <w:sz w:val="17"/>
               </w:rPr>
-              <w:t>plattenwechsler/cmd/drucker/entfernen</w:t>
+              <w:t>plattenwechsler-g6twie23a/cmd/drucker/entfernen</w:t>
             </w:r>
           </w:p>
         </w:tc>
         <w:tc>
           <w:tcPr>
-            <w:tcW w:type="dxa" w:w="2835"/>
+            <w:tcW w:type="dxa" w:w="2551"/>
             <w:shd w:val="clear" w:color="auto" w:fill="FFFFFF"/>
           </w:tcPr>
           <w:p>
             <w:r>
               <w:rPr>
                 <w:rFonts w:ascii="Courier New" w:hAnsi="Courier New"/>
-                <w:b w:val="0"/>
                 <w:sz w:val="17"/>
               </w:rPr>
               <w:t>{"id": 3}</w:t>
@@ -1756,10 +1564,9 @@
           <w:p>
             <w:r>
               <w:rPr>
-                <w:b w:val="0"/>
                 <w:sz w:val="18"/>
               </w:rPr>
-              <w:t>Drucker mit der angegebenen ID aus der Konfiguration entfernen.</w:t>
+              <w:t>Drucker mit angegebener ID entfernen</w:t>
             </w:r>
           </w:p>
         </w:tc>
@@ -1786,7 +1593,7 @@
         <w:pStyle w:val="Heading2"/>
       </w:pPr>
       <w:r>
-        <w:t>6.1  plattenwechsler/status/system</w:t>
+        <w:t>6.1  status/system</w:t>
       </w:r>
     </w:p>
     <w:tbl>
@@ -1820,7 +1627,7 @@
         </w:tc>
         <w:tc>
           <w:tcPr>
-            <w:tcW w:type="dxa" w:w="1417"/>
+            <w:tcW w:type="dxa" w:w="1134"/>
             <w:shd w:val="clear" w:color="auto" w:fill="34363C"/>
           </w:tcPr>
           <w:p>
@@ -1836,7 +1643,7 @@
         </w:tc>
         <w:tc>
           <w:tcPr>
-            <w:tcW w:type="dxa" w:w="5953"/>
+            <w:tcW w:type="dxa" w:w="6236"/>
             <w:shd w:val="clear" w:color="auto" w:fill="34363C"/>
           </w:tcPr>
           <w:p>
@@ -1861,7 +1668,6 @@
             <w:r>
               <w:rPr>
                 <w:rFonts w:ascii="Courier New" w:hAnsi="Courier New"/>
-                <w:b/>
                 <w:sz w:val="17"/>
               </w:rPr>
               <w:t>system_state</w:t>
@@ -1870,14 +1676,13 @@
         </w:tc>
         <w:tc>
           <w:tcPr>
-            <w:tcW w:type="dxa" w:w="1417"/>
+            <w:tcW w:type="dxa" w:w="1134"/>
             <w:shd w:val="clear" w:color="auto" w:fill="F5F5F5"/>
           </w:tcPr>
           <w:p>
             <w:r>
               <w:rPr>
-                <w:b w:val="0"/>
-                <w:sz w:val="17"/>
+                <w:sz w:val="18"/>
               </w:rPr>
               <w:t>String</w:t>
             </w:r>
@@ -1885,15 +1690,14 @@
         </w:tc>
         <w:tc>
           <w:tcPr>
-            <w:tcW w:type="dxa" w:w="5953"/>
+            <w:tcW w:type="dxa" w:w="6236"/>
             <w:shd w:val="clear" w:color="auto" w:fill="F5F5F5"/>
           </w:tcPr>
           <w:p>
             <w:r>
               <w:rPr>
                 <w:rFonts w:ascii="Courier New" w:hAnsi="Courier New"/>
-                <w:b w:val="0"/>
-                <w:sz w:val="16"/>
+                <w:sz w:val="17"/>
               </w:rPr>
               <w:t>INIT | REFERENZFAHRT | BEREITSCHAFT | PLATTENWECHSEL | SERVICE | FEHLER | NOT_AUS</w:t>
             </w:r>
@@ -1910,7 +1714,6 @@
             <w:r>
               <w:rPr>
                 <w:rFonts w:ascii="Courier New" w:hAnsi="Courier New"/>
-                <w:b/>
                 <w:sz w:val="17"/>
               </w:rPr>
               <w:t>queue_length</w:t>
@@ -1919,14 +1722,13 @@
         </w:tc>
         <w:tc>
           <w:tcPr>
-            <w:tcW w:type="dxa" w:w="1417"/>
+            <w:tcW w:type="dxa" w:w="1134"/>
             <w:shd w:val="clear" w:color="auto" w:fill="FFFFFF"/>
           </w:tcPr>
           <w:p>
             <w:r>
               <w:rPr>
-                <w:b w:val="0"/>
-                <w:sz w:val="17"/>
+                <w:sz w:val="18"/>
               </w:rPr>
               <w:t>Integer</w:t>
             </w:r>
@@ -1934,15 +1736,14 @@
         </w:tc>
         <w:tc>
           <w:tcPr>
-            <w:tcW w:type="dxa" w:w="5953"/>
+            <w:tcW w:type="dxa" w:w="6236"/>
             <w:shd w:val="clear" w:color="auto" w:fill="FFFFFF"/>
           </w:tcPr>
           <w:p>
             <w:r>
               <w:rPr>
                 <w:rFonts w:ascii="Courier New" w:hAnsi="Courier New"/>
-                <w:b w:val="0"/>
-                <w:sz w:val="16"/>
+                <w:sz w:val="17"/>
               </w:rPr>
               <w:t>Anzahl Aufträge in der Warteschlange</w:t>
             </w:r>
@@ -1959,41 +1760,38 @@
             <w:r>
               <w:rPr>
                 <w:rFonts w:ascii="Courier New" w:hAnsi="Courier New"/>
-                <w:b/>
                 <w:sz w:val="17"/>
               </w:rPr>
-              <w:t>queue</w:t>
+              <w:t>aktiver_drucker</w:t>
             </w:r>
           </w:p>
         </w:tc>
         <w:tc>
           <w:tcPr>
-            <w:tcW w:type="dxa" w:w="1417"/>
+            <w:tcW w:type="dxa" w:w="1134"/>
             <w:shd w:val="clear" w:color="auto" w:fill="F5F5F5"/>
           </w:tcPr>
           <w:p>
             <w:r>
               <w:rPr>
-                <w:b w:val="0"/>
-                <w:sz w:val="17"/>
+                <w:sz w:val="18"/>
               </w:rPr>
-              <w:t>Array</w:t>
+              <w:t>Integer</w:t>
             </w:r>
           </w:p>
         </w:tc>
         <w:tc>
           <w:tcPr>
-            <w:tcW w:type="dxa" w:w="5953"/>
+            <w:tcW w:type="dxa" w:w="6236"/>
             <w:shd w:val="clear" w:color="auto" w:fill="F5F5F5"/>
           </w:tcPr>
           <w:p>
             <w:r>
               <w:rPr>
                 <w:rFonts w:ascii="Courier New" w:hAnsi="Courier New"/>
-                <w:b w:val="0"/>
-                <w:sz w:val="16"/>
+                <w:sz w:val="17"/>
               </w:rPr>
-              <w:t>[{"id":1, "drucker":2, "quelle":"MQTT", "ts":1234567890.0}]</w:t>
+              <w:t>ID des laufenden Druckers, sonst null</w:t>
             </w:r>
           </w:p>
         </w:tc>
@@ -2008,41 +1806,38 @@
             <w:r>
               <w:rPr>
                 <w:rFonts w:ascii="Courier New" w:hAnsi="Courier New"/>
-                <w:b/>
                 <w:sz w:val="17"/>
               </w:rPr>
-              <w:t>aktiver_drucker</w:t>
+              <w:t>drucker_status</w:t>
             </w:r>
           </w:p>
         </w:tc>
         <w:tc>
           <w:tcPr>
-            <w:tcW w:type="dxa" w:w="1417"/>
+            <w:tcW w:type="dxa" w:w="1134"/>
             <w:shd w:val="clear" w:color="auto" w:fill="FFFFFF"/>
           </w:tcPr>
           <w:p>
             <w:r>
               <w:rPr>
-                <w:b w:val="0"/>
-                <w:sz w:val="17"/>
+                <w:sz w:val="18"/>
               </w:rPr>
-              <w:t>Integer</w:t>
+              <w:t>Object</w:t>
             </w:r>
           </w:p>
         </w:tc>
         <w:tc>
           <w:tcPr>
-            <w:tcW w:type="dxa" w:w="5953"/>
+            <w:tcW w:type="dxa" w:w="6236"/>
             <w:shd w:val="clear" w:color="auto" w:fill="FFFFFF"/>
           </w:tcPr>
           <w:p>
             <w:r>
               <w:rPr>
                 <w:rFonts w:ascii="Courier New" w:hAnsi="Courier New"/>
-                <w:b w:val="0"/>
-                <w:sz w:val="16"/>
+                <w:sz w:val="17"/>
               </w:rPr>
-              <w:t>ID des aktuell gewechselten Druckers, sonst null</w:t>
+              <w:t>{"1": "bereit"}  — Werte: bereit | druckt | in_queue | aktiv</w:t>
             </w:r>
           </w:p>
         </w:tc>
@@ -2057,105 +1852,6 @@
             <w:r>
               <w:rPr>
                 <w:rFonts w:ascii="Courier New" w:hAnsi="Courier New"/>
-                <w:b/>
-                <w:sz w:val="17"/>
-              </w:rPr>
-              <w:t>drucker_status</w:t>
-            </w:r>
-          </w:p>
-        </w:tc>
-        <w:tc>
-          <w:tcPr>
-            <w:tcW w:type="dxa" w:w="1417"/>
-            <w:shd w:val="clear" w:color="auto" w:fill="F5F5F5"/>
-          </w:tcPr>
-          <w:p>
-            <w:r>
-              <w:rPr>
-                <w:b w:val="0"/>
-                <w:sz w:val="17"/>
-              </w:rPr>
-              <w:t>Object</w:t>
-            </w:r>
-          </w:p>
-        </w:tc>
-        <w:tc>
-          <w:tcPr>
-            <w:tcW w:type="dxa" w:w="5953"/>
-            <w:shd w:val="clear" w:color="auto" w:fill="F5F5F5"/>
-          </w:tcPr>
-          <w:p>
-            <w:r>
-              <w:rPr>
-                <w:rFonts w:ascii="Courier New" w:hAnsi="Courier New"/>
-                <w:b w:val="0"/>
-                <w:sz w:val="16"/>
-              </w:rPr>
-              <w:t>{"1": "bereit", "2": "druckt"}  — Werte: bereit | druckt | in_queue | aktiv</w:t>
-            </w:r>
-          </w:p>
-        </w:tc>
-      </w:tr>
-      <w:tr>
-        <w:tc>
-          <w:tcPr>
-            <w:tcW w:type="dxa" w:w="2551"/>
-            <w:shd w:val="clear" w:color="auto" w:fill="FFFFFF"/>
-          </w:tcPr>
-          <w:p>
-            <w:r>
-              <w:rPr>
-                <w:rFonts w:ascii="Courier New" w:hAnsi="Courier New"/>
-                <w:b/>
-                <w:sz w:val="17"/>
-              </w:rPr>
-              <w:t>drucker_config</w:t>
-            </w:r>
-          </w:p>
-        </w:tc>
-        <w:tc>
-          <w:tcPr>
-            <w:tcW w:type="dxa" w:w="1417"/>
-            <w:shd w:val="clear" w:color="auto" w:fill="FFFFFF"/>
-          </w:tcPr>
-          <w:p>
-            <w:r>
-              <w:rPr>
-                <w:b w:val="0"/>
-                <w:sz w:val="17"/>
-              </w:rPr>
-              <w:t>Array</w:t>
-            </w:r>
-          </w:p>
-        </w:tc>
-        <w:tc>
-          <w:tcPr>
-            <w:tcW w:type="dxa" w:w="5953"/>
-            <w:shd w:val="clear" w:color="auto" w:fill="FFFFFF"/>
-          </w:tcPr>
-          <w:p>
-            <w:r>
-              <w:rPr>
-                <w:rFonts w:ascii="Courier New" w:hAnsi="Courier New"/>
-                <w:b w:val="0"/>
-                <w:sz w:val="16"/>
-              </w:rPr>
-              <w:t>Liste aller konfigurierten Drucker (→ 6.6)</w:t>
-            </w:r>
-          </w:p>
-        </w:tc>
-      </w:tr>
-      <w:tr>
-        <w:tc>
-          <w:tcPr>
-            <w:tcW w:type="dxa" w:w="2551"/>
-            <w:shd w:val="clear" w:color="auto" w:fill="F5F5F5"/>
-          </w:tcPr>
-          <w:p>
-            <w:r>
-              <w:rPr>
-                <w:rFonts w:ascii="Courier New" w:hAnsi="Courier New"/>
-                <w:b/>
                 <w:sz w:val="17"/>
               </w:rPr>
               <w:t>fehler</w:t>
@@ -2164,14 +1860,13 @@
         </w:tc>
         <w:tc>
           <w:tcPr>
-            <w:tcW w:type="dxa" w:w="1417"/>
+            <w:tcW w:type="dxa" w:w="1134"/>
             <w:shd w:val="clear" w:color="auto" w:fill="F5F5F5"/>
           </w:tcPr>
           <w:p>
             <w:r>
               <w:rPr>
-                <w:b w:val="0"/>
-                <w:sz w:val="17"/>
+                <w:sz w:val="18"/>
               </w:rPr>
               <w:t>Object</w:t>
             </w:r>
@@ -2179,15 +1874,14 @@
         </w:tc>
         <w:tc>
           <w:tcPr>
-            <w:tcW w:type="dxa" w:w="5953"/>
+            <w:tcW w:type="dxa" w:w="6236"/>
             <w:shd w:val="clear" w:color="auto" w:fill="F5F5F5"/>
           </w:tcPr>
           <w:p>
             <w:r>
               <w:rPr>
                 <w:rFonts w:ascii="Courier New" w:hAnsi="Courier New"/>
-                <w:b w:val="0"/>
-                <w:sz w:val="16"/>
+                <w:sz w:val="17"/>
               </w:rPr>
               <w:t>null  oder Fehler-Objekt (→ 6.3)</w:t>
             </w:r>
@@ -2204,41 +1898,38 @@
             <w:r>
               <w:rPr>
                 <w:rFonts w:ascii="Courier New" w:hAnsi="Courier New"/>
-                <w:b/>
                 <w:sz w:val="17"/>
               </w:rPr>
-              <w:t>esp</w:t>
+              <w:t>stats.erfolg</w:t>
             </w:r>
           </w:p>
         </w:tc>
         <w:tc>
           <w:tcPr>
-            <w:tcW w:type="dxa" w:w="1417"/>
+            <w:tcW w:type="dxa" w:w="1134"/>
             <w:shd w:val="clear" w:color="auto" w:fill="FFFFFF"/>
           </w:tcPr>
           <w:p>
             <w:r>
               <w:rPr>
-                <w:b w:val="0"/>
-                <w:sz w:val="17"/>
+                <w:sz w:val="18"/>
               </w:rPr>
-              <w:t>Object</w:t>
+              <w:t>Integer</w:t>
             </w:r>
           </w:p>
         </w:tc>
         <w:tc>
           <w:tcPr>
-            <w:tcW w:type="dxa" w:w="5953"/>
+            <w:tcW w:type="dxa" w:w="6236"/>
             <w:shd w:val="clear" w:color="auto" w:fill="FFFFFF"/>
           </w:tcPr>
           <w:p>
             <w:r>
               <w:rPr>
                 <w:rFonts w:ascii="Courier New" w:hAnsi="Courier New"/>
-                <w:b w:val="0"/>
-                <w:sz w:val="16"/>
+                <w:sz w:val="17"/>
               </w:rPr>
-              <w:t>ESP-Snapshot (→ 6.2)</w:t>
+              <w:t>Erfolgreich abgeschlossene Plattenwechsel</w:t>
             </w:r>
           </w:p>
         </w:tc>
@@ -2253,105 +1944,6 @@
             <w:r>
               <w:rPr>
                 <w:rFonts w:ascii="Courier New" w:hAnsi="Courier New"/>
-                <w:b/>
-                <w:sz w:val="17"/>
-              </w:rPr>
-              <w:t>stats.erfolg</w:t>
-            </w:r>
-          </w:p>
-        </w:tc>
-        <w:tc>
-          <w:tcPr>
-            <w:tcW w:type="dxa" w:w="1417"/>
-            <w:shd w:val="clear" w:color="auto" w:fill="F5F5F5"/>
-          </w:tcPr>
-          <w:p>
-            <w:r>
-              <w:rPr>
-                <w:b w:val="0"/>
-                <w:sz w:val="17"/>
-              </w:rPr>
-              <w:t>Integer</w:t>
-            </w:r>
-          </w:p>
-        </w:tc>
-        <w:tc>
-          <w:tcPr>
-            <w:tcW w:type="dxa" w:w="5953"/>
-            <w:shd w:val="clear" w:color="auto" w:fill="F5F5F5"/>
-          </w:tcPr>
-          <w:p>
-            <w:r>
-              <w:rPr>
-                <w:rFonts w:ascii="Courier New" w:hAnsi="Courier New"/>
-                <w:b w:val="0"/>
-                <w:sz w:val="16"/>
-              </w:rPr>
-              <w:t>Anzahl erfolgreich abgeschlossener Plattenwechsel</w:t>
-            </w:r>
-          </w:p>
-        </w:tc>
-      </w:tr>
-      <w:tr>
-        <w:tc>
-          <w:tcPr>
-            <w:tcW w:type="dxa" w:w="2551"/>
-            <w:shd w:val="clear" w:color="auto" w:fill="FFFFFF"/>
-          </w:tcPr>
-          <w:p>
-            <w:r>
-              <w:rPr>
-                <w:rFonts w:ascii="Courier New" w:hAnsi="Courier New"/>
-                <w:b/>
-                <w:sz w:val="17"/>
-              </w:rPr>
-              <w:t>stats.abgelehnt</w:t>
-            </w:r>
-          </w:p>
-        </w:tc>
-        <w:tc>
-          <w:tcPr>
-            <w:tcW w:type="dxa" w:w="1417"/>
-            <w:shd w:val="clear" w:color="auto" w:fill="FFFFFF"/>
-          </w:tcPr>
-          <w:p>
-            <w:r>
-              <w:rPr>
-                <w:b w:val="0"/>
-                <w:sz w:val="17"/>
-              </w:rPr>
-              <w:t>Integer</w:t>
-            </w:r>
-          </w:p>
-        </w:tc>
-        <w:tc>
-          <w:tcPr>
-            <w:tcW w:type="dxa" w:w="5953"/>
-            <w:shd w:val="clear" w:color="auto" w:fill="FFFFFF"/>
-          </w:tcPr>
-          <w:p>
-            <w:r>
-              <w:rPr>
-                <w:rFonts w:ascii="Courier New" w:hAnsi="Courier New"/>
-                <w:b w:val="0"/>
-                <w:sz w:val="16"/>
-              </w:rPr>
-              <w:t>Anzahl abgelehnter Aufträge</w:t>
-            </w:r>
-          </w:p>
-        </w:tc>
-      </w:tr>
-      <w:tr>
-        <w:tc>
-          <w:tcPr>
-            <w:tcW w:type="dxa" w:w="2551"/>
-            <w:shd w:val="clear" w:color="auto" w:fill="F5F5F5"/>
-          </w:tcPr>
-          <w:p>
-            <w:r>
-              <w:rPr>
-                <w:rFonts w:ascii="Courier New" w:hAnsi="Courier New"/>
-                <w:b/>
                 <w:sz w:val="17"/>
               </w:rPr>
               <w:t>stats.fehler</w:t>
@@ -2360,14 +1952,13 @@
         </w:tc>
         <w:tc>
           <w:tcPr>
-            <w:tcW w:type="dxa" w:w="1417"/>
+            <w:tcW w:type="dxa" w:w="1134"/>
             <w:shd w:val="clear" w:color="auto" w:fill="F5F5F5"/>
           </w:tcPr>
           <w:p>
             <w:r>
               <w:rPr>
-                <w:b w:val="0"/>
-                <w:sz w:val="17"/>
+                <w:sz w:val="18"/>
               </w:rPr>
               <w:t>Integer</w:t>
             </w:r>
@@ -2375,66 +1966,16 @@
         </w:tc>
         <w:tc>
           <w:tcPr>
-            <w:tcW w:type="dxa" w:w="5953"/>
+            <w:tcW w:type="dxa" w:w="6236"/>
             <w:shd w:val="clear" w:color="auto" w:fill="F5F5F5"/>
           </w:tcPr>
           <w:p>
             <w:r>
               <w:rPr>
                 <w:rFonts w:ascii="Courier New" w:hAnsi="Courier New"/>
-                <w:b w:val="0"/>
-                <w:sz w:val="16"/>
+                <w:sz w:val="17"/>
               </w:rPr>
               <w:t>Gesamtanzahl aufgetretener Fehler</w:t>
-            </w:r>
-          </w:p>
-        </w:tc>
-      </w:tr>
-      <w:tr>
-        <w:tc>
-          <w:tcPr>
-            <w:tcW w:type="dxa" w:w="2551"/>
-            <w:shd w:val="clear" w:color="auto" w:fill="FFFFFF"/>
-          </w:tcPr>
-          <w:p>
-            <w:r>
-              <w:rPr>
-                <w:rFonts w:ascii="Courier New" w:hAnsi="Courier New"/>
-                <w:b/>
-                <w:sz w:val="17"/>
-              </w:rPr>
-              <w:t>stats.letzter_dauer_s</w:t>
-            </w:r>
-          </w:p>
-        </w:tc>
-        <w:tc>
-          <w:tcPr>
-            <w:tcW w:type="dxa" w:w="1417"/>
-            <w:shd w:val="clear" w:color="auto" w:fill="FFFFFF"/>
-          </w:tcPr>
-          <w:p>
-            <w:r>
-              <w:rPr>
-                <w:b w:val="0"/>
-                <w:sz w:val="17"/>
-              </w:rPr>
-              <w:t>Float</w:t>
-            </w:r>
-          </w:p>
-        </w:tc>
-        <w:tc>
-          <w:tcPr>
-            <w:tcW w:type="dxa" w:w="5953"/>
-            <w:shd w:val="clear" w:color="auto" w:fill="FFFFFF"/>
-          </w:tcPr>
-          <w:p>
-            <w:r>
-              <w:rPr>
-                <w:rFonts w:ascii="Courier New" w:hAnsi="Courier New"/>
-                <w:b w:val="0"/>
-                <w:sz w:val="16"/>
-              </w:rPr>
-              <w:t>Dauer des letzten Plattenwechsels in Sekunden</w:t>
             </w:r>
           </w:p>
         </w:tc>
@@ -2445,7 +1986,7 @@
         <w:pStyle w:val="Heading2"/>
       </w:pPr>
       <w:r>
-        <w:t>6.2  plattenwechsler/status/esp</w:t>
+        <w:t>6.2  status/esp</w:t>
       </w:r>
     </w:p>
     <w:tbl>
@@ -2479,7 +2020,7 @@
         </w:tc>
         <w:tc>
           <w:tcPr>
-            <w:tcW w:type="dxa" w:w="1417"/>
+            <w:tcW w:type="dxa" w:w="1134"/>
             <w:shd w:val="clear" w:color="auto" w:fill="34363C"/>
           </w:tcPr>
           <w:p>
@@ -2495,7 +2036,7 @@
         </w:tc>
         <w:tc>
           <w:tcPr>
-            <w:tcW w:type="dxa" w:w="5953"/>
+            <w:tcW w:type="dxa" w:w="6236"/>
             <w:shd w:val="clear" w:color="auto" w:fill="34363C"/>
           </w:tcPr>
           <w:p>
@@ -2520,7 +2061,6 @@
             <w:r>
               <w:rPr>
                 <w:rFonts w:ascii="Courier New" w:hAnsi="Courier New"/>
-                <w:b/>
                 <w:sz w:val="17"/>
               </w:rPr>
               <w:t>connected</w:t>
@@ -2529,14 +2069,13 @@
         </w:tc>
         <w:tc>
           <w:tcPr>
-            <w:tcW w:type="dxa" w:w="1417"/>
+            <w:tcW w:type="dxa" w:w="1134"/>
             <w:shd w:val="clear" w:color="auto" w:fill="F5F5F5"/>
           </w:tcPr>
           <w:p>
             <w:r>
               <w:rPr>
-                <w:b w:val="0"/>
-                <w:sz w:val="17"/>
+                <w:sz w:val="18"/>
               </w:rPr>
               <w:t>Bool</w:t>
             </w:r>
@@ -2544,17 +2083,16 @@
         </w:tc>
         <w:tc>
           <w:tcPr>
-            <w:tcW w:type="dxa" w:w="5953"/>
+            <w:tcW w:type="dxa" w:w="6236"/>
             <w:shd w:val="clear" w:color="auto" w:fill="F5F5F5"/>
           </w:tcPr>
           <w:p>
             <w:r>
               <w:rPr>
                 <w:rFonts w:ascii="Courier New" w:hAnsi="Courier New"/>
-                <w:b w:val="0"/>
-                <w:sz w:val="16"/>
+                <w:sz w:val="17"/>
               </w:rPr>
-              <w:t>true wenn ESP über Seriell verbunden</w:t>
+              <w:t>true wenn ESP verbunden</w:t>
             </w:r>
           </w:p>
         </w:tc>
@@ -2569,41 +2107,38 @@
             <w:r>
               <w:rPr>
                 <w:rFonts w:ascii="Courier New" w:hAnsi="Courier New"/>
-                <w:b/>
                 <w:sz w:val="17"/>
               </w:rPr>
-              <w:t>state</w:t>
+              <w:t>referenced</w:t>
             </w:r>
           </w:p>
         </w:tc>
         <w:tc>
           <w:tcPr>
-            <w:tcW w:type="dxa" w:w="1417"/>
+            <w:tcW w:type="dxa" w:w="1134"/>
             <w:shd w:val="clear" w:color="auto" w:fill="FFFFFF"/>
           </w:tcPr>
           <w:p>
             <w:r>
               <w:rPr>
-                <w:b w:val="0"/>
-                <w:sz w:val="17"/>
+                <w:sz w:val="18"/>
               </w:rPr>
-              <w:t>String</w:t>
+              <w:t>Bool</w:t>
             </w:r>
           </w:p>
         </w:tc>
         <w:tc>
           <w:tcPr>
-            <w:tcW w:type="dxa" w:w="5953"/>
+            <w:tcW w:type="dxa" w:w="6236"/>
             <w:shd w:val="clear" w:color="auto" w:fill="FFFFFF"/>
           </w:tcPr>
           <w:p>
             <w:r>
               <w:rPr>
                 <w:rFonts w:ascii="Courier New" w:hAnsi="Courier New"/>
-                <w:b w:val="0"/>
-                <w:sz w:val="16"/>
+                <w:sz w:val="17"/>
               </w:rPr>
-              <w:t>NOT_REFERENCED | READY | BUSY_HOMING | BUSY_MOVING | BUSY_PICKUP | BUSY_DEPOSIT | STOPPED | ERROR</w:t>
+              <w:t>true nach Referenzfahrt</w:t>
             </w:r>
           </w:p>
         </w:tc>
@@ -2618,41 +2153,38 @@
             <w:r>
               <w:rPr>
                 <w:rFonts w:ascii="Courier New" w:hAnsi="Courier New"/>
-                <w:b/>
                 <w:sz w:val="17"/>
               </w:rPr>
-              <w:t>referenced</w:t>
+              <w:t>x_mm</w:t>
             </w:r>
           </w:p>
         </w:tc>
         <w:tc>
           <w:tcPr>
-            <w:tcW w:type="dxa" w:w="1417"/>
+            <w:tcW w:type="dxa" w:w="1134"/>
             <w:shd w:val="clear" w:color="auto" w:fill="F5F5F5"/>
           </w:tcPr>
           <w:p>
             <w:r>
               <w:rPr>
-                <w:b w:val="0"/>
-                <w:sz w:val="17"/>
+                <w:sz w:val="18"/>
               </w:rPr>
-              <w:t>Bool</w:t>
+              <w:t>Integer</w:t>
             </w:r>
           </w:p>
         </w:tc>
         <w:tc>
           <w:tcPr>
-            <w:tcW w:type="dxa" w:w="5953"/>
+            <w:tcW w:type="dxa" w:w="6236"/>
             <w:shd w:val="clear" w:color="auto" w:fill="F5F5F5"/>
           </w:tcPr>
           <w:p>
             <w:r>
               <w:rPr>
                 <w:rFonts w:ascii="Courier New" w:hAnsi="Courier New"/>
-                <w:b w:val="0"/>
-                <w:sz w:val="16"/>
+                <w:sz w:val="17"/>
               </w:rPr>
-              <w:t>true nach erfolgreicher Referenzfahrt</w:t>
+              <w:t>Aktuelle X-Position in mm</w:t>
             </w:r>
           </w:p>
         </w:tc>
@@ -2667,23 +2199,21 @@
             <w:r>
               <w:rPr>
                 <w:rFonts w:ascii="Courier New" w:hAnsi="Courier New"/>
-                <w:b/>
                 <w:sz w:val="17"/>
               </w:rPr>
-              <w:t>x_mm</w:t>
+              <w:t>z_mm</w:t>
             </w:r>
           </w:p>
         </w:tc>
         <w:tc>
           <w:tcPr>
-            <w:tcW w:type="dxa" w:w="1417"/>
+            <w:tcW w:type="dxa" w:w="1134"/>
             <w:shd w:val="clear" w:color="auto" w:fill="FFFFFF"/>
           </w:tcPr>
           <w:p>
             <w:r>
               <w:rPr>
-                <w:b w:val="0"/>
-                <w:sz w:val="17"/>
+                <w:sz w:val="18"/>
               </w:rPr>
               <w:t>Integer</w:t>
             </w:r>
@@ -2691,17 +2221,16 @@
         </w:tc>
         <w:tc>
           <w:tcPr>
-            <w:tcW w:type="dxa" w:w="5953"/>
+            <w:tcW w:type="dxa" w:w="6236"/>
             <w:shd w:val="clear" w:color="auto" w:fill="FFFFFF"/>
           </w:tcPr>
           <w:p>
             <w:r>
               <w:rPr>
                 <w:rFonts w:ascii="Courier New" w:hAnsi="Courier New"/>
-                <w:b w:val="0"/>
-                <w:sz w:val="16"/>
+                <w:sz w:val="17"/>
               </w:rPr>
-              <w:t>Aktuelle X-Position in mm</w:t>
+              <w:t>Aktuelle Z-Position in mm</w:t>
             </w:r>
           </w:p>
         </w:tc>
@@ -2716,41 +2245,38 @@
             <w:r>
               <w:rPr>
                 <w:rFonts w:ascii="Courier New" w:hAnsi="Courier New"/>
-                <w:b/>
                 <w:sz w:val="17"/>
               </w:rPr>
-              <w:t>z_mm</w:t>
+              <w:t>busy</w:t>
             </w:r>
           </w:p>
         </w:tc>
         <w:tc>
           <w:tcPr>
-            <w:tcW w:type="dxa" w:w="1417"/>
+            <w:tcW w:type="dxa" w:w="1134"/>
             <w:shd w:val="clear" w:color="auto" w:fill="F5F5F5"/>
           </w:tcPr>
           <w:p>
             <w:r>
               <w:rPr>
-                <w:b w:val="0"/>
-                <w:sz w:val="17"/>
+                <w:sz w:val="18"/>
               </w:rPr>
-              <w:t>Integer</w:t>
+              <w:t>Bool</w:t>
             </w:r>
           </w:p>
         </w:tc>
         <w:tc>
           <w:tcPr>
-            <w:tcW w:type="dxa" w:w="5953"/>
+            <w:tcW w:type="dxa" w:w="6236"/>
             <w:shd w:val="clear" w:color="auto" w:fill="F5F5F5"/>
           </w:tcPr>
           <w:p>
             <w:r>
               <w:rPr>
                 <w:rFonts w:ascii="Courier New" w:hAnsi="Courier New"/>
-                <w:b w:val="0"/>
-                <w:sz w:val="16"/>
+                <w:sz w:val="17"/>
               </w:rPr>
-              <w:t>Aktuelle Z-Position in mm</w:t>
+              <w:t>true während einer Bewegung</w:t>
             </w:r>
           </w:p>
         </w:tc>
@@ -2765,23 +2291,21 @@
             <w:r>
               <w:rPr>
                 <w:rFonts w:ascii="Courier New" w:hAnsi="Courier New"/>
-                <w:b/>
                 <w:sz w:val="17"/>
               </w:rPr>
-              <w:t>busy</w:t>
+              <w:t>has_plate</w:t>
             </w:r>
           </w:p>
         </w:tc>
         <w:tc>
           <w:tcPr>
-            <w:tcW w:type="dxa" w:w="1417"/>
+            <w:tcW w:type="dxa" w:w="1134"/>
             <w:shd w:val="clear" w:color="auto" w:fill="FFFFFF"/>
           </w:tcPr>
           <w:p>
             <w:r>
               <w:rPr>
-                <w:b w:val="0"/>
-                <w:sz w:val="17"/>
+                <w:sz w:val="18"/>
               </w:rPr>
               <w:t>Bool</w:t>
             </w:r>
@@ -2789,17 +2313,16 @@
         </w:tc>
         <w:tc>
           <w:tcPr>
-            <w:tcW w:type="dxa" w:w="5953"/>
+            <w:tcW w:type="dxa" w:w="6236"/>
             <w:shd w:val="clear" w:color="auto" w:fill="FFFFFF"/>
           </w:tcPr>
           <w:p>
             <w:r>
               <w:rPr>
                 <w:rFonts w:ascii="Courier New" w:hAnsi="Courier New"/>
-                <w:b w:val="0"/>
-                <w:sz w:val="16"/>
+                <w:sz w:val="17"/>
               </w:rPr>
-              <w:t>true während einer laufenden Bewegung</w:t>
+              <w:t>true wenn Platte auf der Gabel liegt</w:t>
             </w:r>
           </w:p>
         </w:tc>
@@ -2814,23 +2337,21 @@
             <w:r>
               <w:rPr>
                 <w:rFonts w:ascii="Courier New" w:hAnsi="Courier New"/>
-                <w:b/>
                 <w:sz w:val="17"/>
               </w:rPr>
-              <w:t>has_plate</w:t>
+              <w:t>obstacle_ok</w:t>
             </w:r>
           </w:p>
         </w:tc>
         <w:tc>
           <w:tcPr>
-            <w:tcW w:type="dxa" w:w="1417"/>
+            <w:tcW w:type="dxa" w:w="1134"/>
             <w:shd w:val="clear" w:color="auto" w:fill="F5F5F5"/>
           </w:tcPr>
           <w:p>
             <w:r>
               <w:rPr>
-                <w:b w:val="0"/>
-                <w:sz w:val="17"/>
+                <w:sz w:val="18"/>
               </w:rPr>
               <w:t>Bool</w:t>
             </w:r>
@@ -2838,17 +2359,16 @@
         </w:tc>
         <w:tc>
           <w:tcPr>
-            <w:tcW w:type="dxa" w:w="5953"/>
+            <w:tcW w:type="dxa" w:w="6236"/>
             <w:shd w:val="clear" w:color="auto" w:fill="F5F5F5"/>
           </w:tcPr>
           <w:p>
             <w:r>
               <w:rPr>
                 <w:rFonts w:ascii="Courier New" w:hAnsi="Courier New"/>
-                <w:b w:val="0"/>
-                <w:sz w:val="16"/>
+                <w:sz w:val="17"/>
               </w:rPr>
-              <w:t>true wenn Platte auf der Gabel liegt</w:t>
+              <w:t>true = kein Hindernis</w:t>
             </w:r>
           </w:p>
         </w:tc>
@@ -2863,7 +2383,6 @@
             <w:r>
               <w:rPr>
                 <w:rFonts w:ascii="Courier New" w:hAnsi="Courier New"/>
-                <w:b/>
                 <w:sz w:val="17"/>
               </w:rPr>
               <w:t>door_open</w:t>
@@ -2872,14 +2391,13 @@
         </w:tc>
         <w:tc>
           <w:tcPr>
-            <w:tcW w:type="dxa" w:w="1417"/>
+            <w:tcW w:type="dxa" w:w="1134"/>
             <w:shd w:val="clear" w:color="auto" w:fill="FFFFFF"/>
           </w:tcPr>
           <w:p>
             <w:r>
               <w:rPr>
-                <w:b w:val="0"/>
-                <w:sz w:val="17"/>
+                <w:sz w:val="18"/>
               </w:rPr>
               <w:t>Bool</w:t>
             </w:r>
@@ -2887,164 +2405,16 @@
         </w:tc>
         <w:tc>
           <w:tcPr>
-            <w:tcW w:type="dxa" w:w="5953"/>
+            <w:tcW w:type="dxa" w:w="6236"/>
             <w:shd w:val="clear" w:color="auto" w:fill="FFFFFF"/>
           </w:tcPr>
           <w:p>
             <w:r>
               <w:rPr>
                 <w:rFonts w:ascii="Courier New" w:hAnsi="Courier New"/>
-                <w:b w:val="0"/>
-                <w:sz w:val="16"/>
-              </w:rPr>
-              <w:t>true wenn Druckertür offen (VL53L0X-Sensor)</w:t>
-            </w:r>
-          </w:p>
-        </w:tc>
-      </w:tr>
-      <w:tr>
-        <w:tc>
-          <w:tcPr>
-            <w:tcW w:type="dxa" w:w="2551"/>
-            <w:shd w:val="clear" w:color="auto" w:fill="F5F5F5"/>
-          </w:tcPr>
-          <w:p>
-            <w:r>
-              <w:rPr>
-                <w:rFonts w:ascii="Courier New" w:hAnsi="Courier New"/>
-                <w:b/>
                 <w:sz w:val="17"/>
               </w:rPr>
-              <w:t>door_dist_mm</w:t>
-            </w:r>
-          </w:p>
-        </w:tc>
-        <w:tc>
-          <w:tcPr>
-            <w:tcW w:type="dxa" w:w="1417"/>
-            <w:shd w:val="clear" w:color="auto" w:fill="F5F5F5"/>
-          </w:tcPr>
-          <w:p>
-            <w:r>
-              <w:rPr>
-                <w:b w:val="0"/>
-                <w:sz w:val="17"/>
-              </w:rPr>
-              <w:t>Integer</w:t>
-            </w:r>
-          </w:p>
-        </w:tc>
-        <w:tc>
-          <w:tcPr>
-            <w:tcW w:type="dxa" w:w="5953"/>
-            <w:shd w:val="clear" w:color="auto" w:fill="F5F5F5"/>
-          </w:tcPr>
-          <w:p>
-            <w:r>
-              <w:rPr>
-                <w:rFonts w:ascii="Courier New" w:hAnsi="Courier New"/>
-                <w:b w:val="0"/>
-                <w:sz w:val="16"/>
-              </w:rPr>
-              <w:t>Rohwert Türsensor in mm (Debug)</w:t>
-            </w:r>
-          </w:p>
-        </w:tc>
-      </w:tr>
-      <w:tr>
-        <w:tc>
-          <w:tcPr>
-            <w:tcW w:type="dxa" w:w="2551"/>
-            <w:shd w:val="clear" w:color="auto" w:fill="FFFFFF"/>
-          </w:tcPr>
-          <w:p>
-            <w:r>
-              <w:rPr>
-                <w:rFonts w:ascii="Courier New" w:hAnsi="Courier New"/>
-                <w:b/>
-                <w:sz w:val="17"/>
-              </w:rPr>
-              <w:t>obstacle_ok</w:t>
-            </w:r>
-          </w:p>
-        </w:tc>
-        <w:tc>
-          <w:tcPr>
-            <w:tcW w:type="dxa" w:w="1417"/>
-            <w:shd w:val="clear" w:color="auto" w:fill="FFFFFF"/>
-          </w:tcPr>
-          <w:p>
-            <w:r>
-              <w:rPr>
-                <w:b w:val="0"/>
-                <w:sz w:val="17"/>
-              </w:rPr>
-              <w:t>Bool</w:t>
-            </w:r>
-          </w:p>
-        </w:tc>
-        <w:tc>
-          <w:tcPr>
-            <w:tcW w:type="dxa" w:w="5953"/>
-            <w:shd w:val="clear" w:color="auto" w:fill="FFFFFF"/>
-          </w:tcPr>
-          <w:p>
-            <w:r>
-              <w:rPr>
-                <w:rFonts w:ascii="Courier New" w:hAnsi="Courier New"/>
-                <w:b w:val="0"/>
-                <w:sz w:val="16"/>
-              </w:rPr>
-              <w:t>true = kein Hindernis, false = Hindernis erkannt (TF-Luna)</w:t>
-            </w:r>
-          </w:p>
-        </w:tc>
-      </w:tr>
-      <w:tr>
-        <w:tc>
-          <w:tcPr>
-            <w:tcW w:type="dxa" w:w="2551"/>
-            <w:shd w:val="clear" w:color="auto" w:fill="F5F5F5"/>
-          </w:tcPr>
-          <w:p>
-            <w:r>
-              <w:rPr>
-                <w:rFonts w:ascii="Courier New" w:hAnsi="Courier New"/>
-                <w:b/>
-                <w:sz w:val="17"/>
-              </w:rPr>
-              <w:t>error</w:t>
-            </w:r>
-          </w:p>
-        </w:tc>
-        <w:tc>
-          <w:tcPr>
-            <w:tcW w:type="dxa" w:w="1417"/>
-            <w:shd w:val="clear" w:color="auto" w:fill="F5F5F5"/>
-          </w:tcPr>
-          <w:p>
-            <w:r>
-              <w:rPr>
-                <w:b w:val="0"/>
-                <w:sz w:val="17"/>
-              </w:rPr>
-              <w:t>String</w:t>
-            </w:r>
-          </w:p>
-        </w:tc>
-        <w:tc>
-          <w:tcPr>
-            <w:tcW w:type="dxa" w:w="5953"/>
-            <w:shd w:val="clear" w:color="auto" w:fill="F5F5F5"/>
-          </w:tcPr>
-          <w:p>
-            <w:r>
-              <w:rPr>
-                <w:rFonts w:ascii="Courier New" w:hAnsi="Courier New"/>
-                <w:b w:val="0"/>
-                <w:sz w:val="16"/>
-              </w:rPr>
-              <w:t>Letzter ESP-Fehlercode, z. B. "OBSTACLE", sonst "NONE"</w:t>
+              <w:t>true wenn Druckertür offen</w:t>
             </w:r>
           </w:p>
         </w:tc>
@@ -3055,7 +2425,7 @@
         <w:pStyle w:val="Heading2"/>
       </w:pPr>
       <w:r>
-        <w:t>6.3  plattenwechsler/error</w:t>
+        <w:t>6.3  error</w:t>
       </w:r>
     </w:p>
     <w:tbl>
@@ -3089,7 +2459,7 @@
         </w:tc>
         <w:tc>
           <w:tcPr>
-            <w:tcW w:type="dxa" w:w="1417"/>
+            <w:tcW w:type="dxa" w:w="1134"/>
             <w:shd w:val="clear" w:color="auto" w:fill="34363C"/>
           </w:tcPr>
           <w:p>
@@ -3105,7 +2475,7 @@
         </w:tc>
         <w:tc>
           <w:tcPr>
-            <w:tcW w:type="dxa" w:w="5953"/>
+            <w:tcW w:type="dxa" w:w="6236"/>
             <w:shd w:val="clear" w:color="auto" w:fill="34363C"/>
           </w:tcPr>
           <w:p>
@@ -3130,7 +2500,6 @@
             <w:r>
               <w:rPr>
                 <w:rFonts w:ascii="Courier New" w:hAnsi="Courier New"/>
-                <w:b/>
                 <w:sz w:val="17"/>
               </w:rPr>
               <w:t>klasse</w:t>
@@ -3139,14 +2508,13 @@
         </w:tc>
         <w:tc>
           <w:tcPr>
-            <w:tcW w:type="dxa" w:w="1417"/>
+            <w:tcW w:type="dxa" w:w="1134"/>
             <w:shd w:val="clear" w:color="auto" w:fill="F5F5F5"/>
           </w:tcPr>
           <w:p>
             <w:r>
               <w:rPr>
-                <w:b w:val="0"/>
-                <w:sz w:val="17"/>
+                <w:sz w:val="18"/>
               </w:rPr>
               <w:t>String</w:t>
             </w:r>
@@ -3154,17 +2522,16 @@
         </w:tc>
         <w:tc>
           <w:tcPr>
-            <w:tcW w:type="dxa" w:w="5953"/>
+            <w:tcW w:type="dxa" w:w="6236"/>
             <w:shd w:val="clear" w:color="auto" w:fill="F5F5F5"/>
           </w:tcPr>
           <w:p>
             <w:r>
               <w:rPr>
                 <w:rFonts w:ascii="Courier New" w:hAnsi="Courier New"/>
-                <w:b w:val="0"/>
-                <w:sz w:val="16"/>
+                <w:sz w:val="17"/>
               </w:rPr>
-              <w:t>Kommunikationsfehler | Fahrfehler | Hindernis | Sensorfehler | Tuerfehler | Entnahmefehler | Not-Aus | Interner Fehler</w:t>
+              <w:t>Kommunikationsfehler | Fahrfehler | Hindernis | Sensorfehler | Tuerfehler | Entnahmefehler | Not-Aus</w:t>
             </w:r>
           </w:p>
         </w:tc>
@@ -3179,7 +2546,6 @@
             <w:r>
               <w:rPr>
                 <w:rFonts w:ascii="Courier New" w:hAnsi="Courier New"/>
-                <w:b/>
                 <w:sz w:val="17"/>
               </w:rPr>
               <w:t>nachricht</w:t>
@@ -3188,14 +2554,13 @@
         </w:tc>
         <w:tc>
           <w:tcPr>
-            <w:tcW w:type="dxa" w:w="1417"/>
+            <w:tcW w:type="dxa" w:w="1134"/>
             <w:shd w:val="clear" w:color="auto" w:fill="FFFFFF"/>
           </w:tcPr>
           <w:p>
             <w:r>
               <w:rPr>
-                <w:b w:val="0"/>
-                <w:sz w:val="17"/>
+                <w:sz w:val="18"/>
               </w:rPr>
               <w:t>String</w:t>
             </w:r>
@@ -3203,15 +2568,14 @@
         </w:tc>
         <w:tc>
           <w:tcPr>
-            <w:tcW w:type="dxa" w:w="5953"/>
+            <w:tcW w:type="dxa" w:w="6236"/>
             <w:shd w:val="clear" w:color="auto" w:fill="FFFFFF"/>
           </w:tcPr>
           <w:p>
             <w:r>
               <w:rPr>
                 <w:rFonts w:ascii="Courier New" w:hAnsi="Courier New"/>
-                <w:b w:val="0"/>
-                <w:sz w:val="16"/>
+                <w:sz w:val="17"/>
               </w:rPr>
               <w:t>Menschenlesbare Fehlerbeschreibung</w:t>
             </w:r>
@@ -3228,7 +2592,6 @@
             <w:r>
               <w:rPr>
                 <w:rFonts w:ascii="Courier New" w:hAnsi="Courier New"/>
-                <w:b/>
                 <w:sz w:val="17"/>
               </w:rPr>
               <w:t>esp_code</w:t>
@@ -3237,14 +2600,13 @@
         </w:tc>
         <w:tc>
           <w:tcPr>
-            <w:tcW w:type="dxa" w:w="1417"/>
+            <w:tcW w:type="dxa" w:w="1134"/>
             <w:shd w:val="clear" w:color="auto" w:fill="F5F5F5"/>
           </w:tcPr>
           <w:p>
             <w:r>
               <w:rPr>
-                <w:b w:val="0"/>
-                <w:sz w:val="17"/>
+                <w:sz w:val="18"/>
               </w:rPr>
               <w:t>String</w:t>
             </w:r>
@@ -3252,17 +2614,16 @@
         </w:tc>
         <w:tc>
           <w:tcPr>
-            <w:tcW w:type="dxa" w:w="5953"/>
+            <w:tcW w:type="dxa" w:w="6236"/>
             <w:shd w:val="clear" w:color="auto" w:fill="F5F5F5"/>
           </w:tcPr>
           <w:p>
             <w:r>
               <w:rPr>
                 <w:rFonts w:ascii="Courier New" w:hAnsi="Courier New"/>
-                <w:b w:val="0"/>
-                <w:sz w:val="16"/>
+                <w:sz w:val="17"/>
               </w:rPr>
-              <w:t>ESP-interner Fehlercode oder null</w:t>
+              <w:t>ESP-interner Code, z. B. "OBSTACLE", oder null</w:t>
             </w:r>
           </w:p>
         </w:tc>
@@ -3277,7 +2638,6 @@
             <w:r>
               <w:rPr>
                 <w:rFonts w:ascii="Courier New" w:hAnsi="Courier New"/>
-                <w:b/>
                 <w:sz w:val="17"/>
               </w:rPr>
               <w:t>ts</w:t>
@@ -3286,14 +2646,13 @@
         </w:tc>
         <w:tc>
           <w:tcPr>
-            <w:tcW w:type="dxa" w:w="1417"/>
+            <w:tcW w:type="dxa" w:w="1134"/>
             <w:shd w:val="clear" w:color="auto" w:fill="FFFFFF"/>
           </w:tcPr>
           <w:p>
             <w:r>
               <w:rPr>
-                <w:b w:val="0"/>
-                <w:sz w:val="17"/>
+                <w:sz w:val="18"/>
               </w:rPr>
               <w:t>Float</w:t>
             </w:r>
@@ -3301,17 +2660,16 @@
         </w:tc>
         <w:tc>
           <w:tcPr>
-            <w:tcW w:type="dxa" w:w="5953"/>
+            <w:tcW w:type="dxa" w:w="6236"/>
             <w:shd w:val="clear" w:color="auto" w:fill="FFFFFF"/>
           </w:tcPr>
           <w:p>
             <w:r>
               <w:rPr>
                 <w:rFonts w:ascii="Courier New" w:hAnsi="Courier New"/>
-                <w:b w:val="0"/>
-                <w:sz w:val="16"/>
+                <w:sz w:val="17"/>
               </w:rPr>
-              <w:t>Unix-Timestamp des Fehlerzeitpunkts</w:t>
+              <w:t>Unix-Timestamp</w:t>
             </w:r>
           </w:p>
         </w:tc>
@@ -3322,7 +2680,7 @@
         <w:pStyle w:val="Heading2"/>
       </w:pPr>
       <w:r>
-        <w:t>6.4  plattenwechsler/event/auftrag</w:t>
+        <w:t>6.4  event/auftrag</w:t>
       </w:r>
     </w:p>
     <w:tbl>
@@ -3356,7 +2714,7 @@
         </w:tc>
         <w:tc>
           <w:tcPr>
-            <w:tcW w:type="dxa" w:w="1417"/>
+            <w:tcW w:type="dxa" w:w="1134"/>
             <w:shd w:val="clear" w:color="auto" w:fill="34363C"/>
           </w:tcPr>
           <w:p>
@@ -3372,7 +2730,7 @@
         </w:tc>
         <w:tc>
           <w:tcPr>
-            <w:tcW w:type="dxa" w:w="5953"/>
+            <w:tcW w:type="dxa" w:w="6236"/>
             <w:shd w:val="clear" w:color="auto" w:fill="34363C"/>
           </w:tcPr>
           <w:p>
@@ -3397,7 +2755,6 @@
             <w:r>
               <w:rPr>
                 <w:rFonts w:ascii="Courier New" w:hAnsi="Courier New"/>
-                <w:b/>
                 <w:sz w:val="17"/>
               </w:rPr>
               <w:t>auftrag_id</w:t>
@@ -3406,14 +2763,13 @@
         </w:tc>
         <w:tc>
           <w:tcPr>
-            <w:tcW w:type="dxa" w:w="1417"/>
+            <w:tcW w:type="dxa" w:w="1134"/>
             <w:shd w:val="clear" w:color="auto" w:fill="F5F5F5"/>
           </w:tcPr>
           <w:p>
             <w:r>
               <w:rPr>
-                <w:b w:val="0"/>
-                <w:sz w:val="17"/>
+                <w:sz w:val="18"/>
               </w:rPr>
               <w:t>Integer</w:t>
             </w:r>
@@ -3421,15 +2777,14 @@
         </w:tc>
         <w:tc>
           <w:tcPr>
-            <w:tcW w:type="dxa" w:w="5953"/>
+            <w:tcW w:type="dxa" w:w="6236"/>
             <w:shd w:val="clear" w:color="auto" w:fill="F5F5F5"/>
           </w:tcPr>
           <w:p>
             <w:r>
               <w:rPr>
                 <w:rFonts w:ascii="Courier New" w:hAnsi="Courier New"/>
-                <w:b w:val="0"/>
-                <w:sz w:val="16"/>
+                <w:sz w:val="17"/>
               </w:rPr>
               <w:t>Eindeutige Auftrags-ID</w:t>
             </w:r>
@@ -3446,7 +2801,6 @@
             <w:r>
               <w:rPr>
                 <w:rFonts w:ascii="Courier New" w:hAnsi="Courier New"/>
-                <w:b/>
                 <w:sz w:val="17"/>
               </w:rPr>
               <w:t>drucker</w:t>
@@ -3455,14 +2809,13 @@
         </w:tc>
         <w:tc>
           <w:tcPr>
-            <w:tcW w:type="dxa" w:w="1417"/>
+            <w:tcW w:type="dxa" w:w="1134"/>
             <w:shd w:val="clear" w:color="auto" w:fill="FFFFFF"/>
           </w:tcPr>
           <w:p>
             <w:r>
               <w:rPr>
-                <w:b w:val="0"/>
-                <w:sz w:val="17"/>
+                <w:sz w:val="18"/>
               </w:rPr>
               <w:t>Integer</w:t>
             </w:r>
@@ -3470,15 +2823,14 @@
         </w:tc>
         <w:tc>
           <w:tcPr>
-            <w:tcW w:type="dxa" w:w="5953"/>
+            <w:tcW w:type="dxa" w:w="6236"/>
             <w:shd w:val="clear" w:color="auto" w:fill="FFFFFF"/>
           </w:tcPr>
           <w:p>
             <w:r>
               <w:rPr>
                 <w:rFonts w:ascii="Courier New" w:hAnsi="Courier New"/>
-                <w:b w:val="0"/>
-                <w:sz w:val="16"/>
+                <w:sz w:val="17"/>
               </w:rPr>
               <w:t>Drucker-ID</w:t>
             </w:r>
@@ -3495,7 +2847,6 @@
             <w:r>
               <w:rPr>
                 <w:rFonts w:ascii="Courier New" w:hAnsi="Courier New"/>
-                <w:b/>
                 <w:sz w:val="17"/>
               </w:rPr>
               <w:t>quelle</w:t>
@@ -3504,14 +2855,13 @@
         </w:tc>
         <w:tc>
           <w:tcPr>
-            <w:tcW w:type="dxa" w:w="1417"/>
+            <w:tcW w:type="dxa" w:w="1134"/>
             <w:shd w:val="clear" w:color="auto" w:fill="F5F5F5"/>
           </w:tcPr>
           <w:p>
             <w:r>
               <w:rPr>
-                <w:b w:val="0"/>
-                <w:sz w:val="17"/>
+                <w:sz w:val="18"/>
               </w:rPr>
               <w:t>String</w:t>
             </w:r>
@@ -3519,15 +2869,14 @@
         </w:tc>
         <w:tc>
           <w:tcPr>
-            <w:tcW w:type="dxa" w:w="5953"/>
+            <w:tcW w:type="dxa" w:w="6236"/>
             <w:shd w:val="clear" w:color="auto" w:fill="F5F5F5"/>
           </w:tcPr>
           <w:p>
             <w:r>
               <w:rPr>
                 <w:rFonts w:ascii="Courier New" w:hAnsi="Courier New"/>
-                <w:b w:val="0"/>
-                <w:sz w:val="16"/>
+                <w:sz w:val="17"/>
               </w:rPr>
               <w:t>Druckerstatus | Touchdisplay | MQTT | Telegram</w:t>
             </w:r>
@@ -3544,7 +2893,6 @@
             <w:r>
               <w:rPr>
                 <w:rFonts w:ascii="Courier New" w:hAnsi="Courier New"/>
-                <w:b/>
                 <w:sz w:val="17"/>
               </w:rPr>
               <w:t>ts</w:t>
@@ -3553,14 +2901,13 @@
         </w:tc>
         <w:tc>
           <w:tcPr>
-            <w:tcW w:type="dxa" w:w="1417"/>
+            <w:tcW w:type="dxa" w:w="1134"/>
             <w:shd w:val="clear" w:color="auto" w:fill="FFFFFF"/>
           </w:tcPr>
           <w:p>
             <w:r>
               <w:rPr>
-                <w:b w:val="0"/>
-                <w:sz w:val="17"/>
+                <w:sz w:val="18"/>
               </w:rPr>
               <w:t>Float</w:t>
             </w:r>
@@ -3568,15 +2915,14 @@
         </w:tc>
         <w:tc>
           <w:tcPr>
-            <w:tcW w:type="dxa" w:w="5953"/>
+            <w:tcW w:type="dxa" w:w="6236"/>
             <w:shd w:val="clear" w:color="auto" w:fill="FFFFFF"/>
           </w:tcPr>
           <w:p>
             <w:r>
               <w:rPr>
                 <w:rFonts w:ascii="Courier New" w:hAnsi="Courier New"/>
-                <w:b w:val="0"/>
-                <w:sz w:val="16"/>
+                <w:sz w:val="17"/>
               </w:rPr>
               <w:t>Unix-Timestamp Abschluss</w:t>
             </w:r>
@@ -3589,19 +2935,7 @@
         <w:pStyle w:val="Heading2"/>
       </w:pPr>
       <w:r>
-        <w:t>6.5  plattenwechsler/response</w:t>
-      </w:r>
-    </w:p>
-    <w:p>
-      <w:pPr>
-        <w:spacing w:before="0" w:after="80"/>
-      </w:pPr>
-      <w:r>
-        <w:rPr>
-          <w:b w:val="0"/>
-          <w:sz w:val="20"/>
-        </w:rPr>
-        <w:t>Wird nach jedem empfangenen Befehl veröffentlicht. Dient zur Bestätigung, ob der Befehl angenommen wurde.</w:t>
+        <w:t>6.5  response</w:t>
       </w:r>
     </w:p>
     <w:tbl>
@@ -3635,7 +2969,7 @@
         </w:tc>
         <w:tc>
           <w:tcPr>
-            <w:tcW w:type="dxa" w:w="1417"/>
+            <w:tcW w:type="dxa" w:w="1134"/>
             <w:shd w:val="clear" w:color="auto" w:fill="34363C"/>
           </w:tcPr>
           <w:p>
@@ -3651,7 +2985,7 @@
         </w:tc>
         <w:tc>
           <w:tcPr>
-            <w:tcW w:type="dxa" w:w="5953"/>
+            <w:tcW w:type="dxa" w:w="6236"/>
             <w:shd w:val="clear" w:color="auto" w:fill="34363C"/>
           </w:tcPr>
           <w:p>
@@ -3676,7 +3010,6 @@
             <w:r>
               <w:rPr>
                 <w:rFonts w:ascii="Courier New" w:hAnsi="Courier New"/>
-                <w:b/>
                 <w:sz w:val="17"/>
               </w:rPr>
               <w:t>cmd</w:t>
@@ -3685,14 +3018,13 @@
         </w:tc>
         <w:tc>
           <w:tcPr>
-            <w:tcW w:type="dxa" w:w="1417"/>
+            <w:tcW w:type="dxa" w:w="1134"/>
             <w:shd w:val="clear" w:color="auto" w:fill="F5F5F5"/>
           </w:tcPr>
           <w:p>
             <w:r>
               <w:rPr>
-                <w:b w:val="0"/>
-                <w:sz w:val="17"/>
+                <w:sz w:val="18"/>
               </w:rPr>
               <w:t>String</w:t>
             </w:r>
@@ -3700,17 +3032,16 @@
         </w:tc>
         <w:tc>
           <w:tcPr>
-            <w:tcW w:type="dxa" w:w="5953"/>
+            <w:tcW w:type="dxa" w:w="6236"/>
             <w:shd w:val="clear" w:color="auto" w:fill="F5F5F5"/>
           </w:tcPr>
           <w:p>
             <w:r>
               <w:rPr>
                 <w:rFonts w:ascii="Courier New" w:hAnsi="Courier New"/>
-                <w:b w:val="0"/>
-                <w:sz w:val="16"/>
+                <w:sz w:val="17"/>
               </w:rPr>
-              <w:t>Name des Befehls, z. B. "auftrag", "stop", "service/modus"</w:t>
+              <w:t>Name des Befehls, z. B. "auftrag", "stop"</w:t>
             </w:r>
           </w:p>
         </w:tc>
@@ -3725,7 +3056,6 @@
             <w:r>
               <w:rPr>
                 <w:rFonts w:ascii="Courier New" w:hAnsi="Courier New"/>
-                <w:b/>
                 <w:sz w:val="17"/>
               </w:rPr>
               <w:t>ok</w:t>
@@ -3734,14 +3064,13 @@
         </w:tc>
         <w:tc>
           <w:tcPr>
-            <w:tcW w:type="dxa" w:w="1417"/>
+            <w:tcW w:type="dxa" w:w="1134"/>
             <w:shd w:val="clear" w:color="auto" w:fill="FFFFFF"/>
           </w:tcPr>
           <w:p>
             <w:r>
               <w:rPr>
-                <w:b w:val="0"/>
-                <w:sz w:val="17"/>
+                <w:sz w:val="18"/>
               </w:rPr>
               <w:t>Bool</w:t>
             </w:r>
@@ -3749,17 +3078,16 @@
         </w:tc>
         <w:tc>
           <w:tcPr>
-            <w:tcW w:type="dxa" w:w="5953"/>
+            <w:tcW w:type="dxa" w:w="6236"/>
             <w:shd w:val="clear" w:color="auto" w:fill="FFFFFF"/>
           </w:tcPr>
           <w:p>
             <w:r>
               <w:rPr>
                 <w:rFonts w:ascii="Courier New" w:hAnsi="Courier New"/>
-                <w:b w:val="0"/>
-                <w:sz w:val="16"/>
+                <w:sz w:val="17"/>
               </w:rPr>
-              <w:t>true = Befehl angenommen, false = Fehler oder ungültige Parameter</w:t>
+              <w:t>true = Befehl angenommen</w:t>
             </w:r>
           </w:p>
         </w:tc>
@@ -3774,7 +3102,6 @@
             <w:r>
               <w:rPr>
                 <w:rFonts w:ascii="Courier New" w:hAnsi="Courier New"/>
-                <w:b/>
                 <w:sz w:val="17"/>
               </w:rPr>
               <w:t>msg</w:t>
@@ -3783,14 +3110,13 @@
         </w:tc>
         <w:tc>
           <w:tcPr>
-            <w:tcW w:type="dxa" w:w="1417"/>
+            <w:tcW w:type="dxa" w:w="1134"/>
             <w:shd w:val="clear" w:color="auto" w:fill="F5F5F5"/>
           </w:tcPr>
           <w:p>
             <w:r>
               <w:rPr>
-                <w:b w:val="0"/>
-                <w:sz w:val="17"/>
+                <w:sz w:val="18"/>
               </w:rPr>
               <w:t>String</w:t>
             </w:r>
@@ -3798,17 +3124,16 @@
         </w:tc>
         <w:tc>
           <w:tcPr>
-            <w:tcW w:type="dxa" w:w="5953"/>
+            <w:tcW w:type="dxa" w:w="6236"/>
             <w:shd w:val="clear" w:color="auto" w:fill="F5F5F5"/>
           </w:tcPr>
           <w:p>
             <w:r>
               <w:rPr>
                 <w:rFonts w:ascii="Courier New" w:hAnsi="Courier New"/>
-                <w:b w:val="0"/>
-                <w:sz w:val="16"/>
+                <w:sz w:val="17"/>
               </w:rPr>
-              <w:t>Kurze Statusmeldung, z. B. "Drucker 2 in Queue"</w:t>
+              <w:t>Kurze Meldung, z. B. "Drucker 1 in Queue"</w:t>
             </w:r>
           </w:p>
         </w:tc>
@@ -3823,7 +3148,6 @@
             <w:r>
               <w:rPr>
                 <w:rFonts w:ascii="Courier New" w:hAnsi="Courier New"/>
-                <w:b/>
                 <w:sz w:val="17"/>
               </w:rPr>
               <w:t>ts</w:t>
@@ -3832,14 +3156,13 @@
         </w:tc>
         <w:tc>
           <w:tcPr>
-            <w:tcW w:type="dxa" w:w="1417"/>
+            <w:tcW w:type="dxa" w:w="1134"/>
             <w:shd w:val="clear" w:color="auto" w:fill="FFFFFF"/>
           </w:tcPr>
           <w:p>
             <w:r>
               <w:rPr>
-                <w:b w:val="0"/>
-                <w:sz w:val="17"/>
+                <w:sz w:val="18"/>
               </w:rPr>
               <w:t>Float</w:t>
             </w:r>
@@ -3847,17 +3170,16 @@
         </w:tc>
         <w:tc>
           <w:tcPr>
-            <w:tcW w:type="dxa" w:w="5953"/>
+            <w:tcW w:type="dxa" w:w="6236"/>
             <w:shd w:val="clear" w:color="auto" w:fill="FFFFFF"/>
           </w:tcPr>
           <w:p>
             <w:r>
               <w:rPr>
                 <w:rFonts w:ascii="Courier New" w:hAnsi="Courier New"/>
-                <w:b w:val="0"/>
-                <w:sz w:val="16"/>
+                <w:sz w:val="17"/>
               </w:rPr>
-              <w:t>Unix-Timestamp der Antwort</w:t>
+              <w:t>Unix-Timestamp</w:t>
             </w:r>
           </w:p>
         </w:tc>
@@ -3869,18 +3191,6 @@
       </w:pPr>
       <w:r>
         <w:t>6.6  DruckerConfig  (für cmd/drucker/setzen)</w:t>
-      </w:r>
-    </w:p>
-    <w:p>
-      <w:pPr>
-        <w:spacing w:before="0" w:after="80"/>
-      </w:pPr>
-      <w:r>
-        <w:rPr>
-          <w:b w:val="0"/>
-          <w:sz w:val="20"/>
-        </w:rPr>
-        <w:t>Alle Felder für das Anlegen oder Ändern eines Druckers. Wird "id" weggelassen, vergibt das System die nächste freie ID.</w:t>
       </w:r>
     </w:p>
     <w:tbl>
@@ -3914,7 +3224,7 @@
         </w:tc>
         <w:tc>
           <w:tcPr>
-            <w:tcW w:type="dxa" w:w="1417"/>
+            <w:tcW w:type="dxa" w:w="1134"/>
             <w:shd w:val="clear" w:color="auto" w:fill="34363C"/>
           </w:tcPr>
           <w:p>
@@ -3930,7 +3240,7 @@
         </w:tc>
         <w:tc>
           <w:tcPr>
-            <w:tcW w:type="dxa" w:w="5953"/>
+            <w:tcW w:type="dxa" w:w="6236"/>
             <w:shd w:val="clear" w:color="auto" w:fill="34363C"/>
           </w:tcPr>
           <w:p>
@@ -3955,7 +3265,6 @@
             <w:r>
               <w:rPr>
                 <w:rFonts w:ascii="Courier New" w:hAnsi="Courier New"/>
-                <w:b/>
                 <w:sz w:val="17"/>
               </w:rPr>
               <w:t>id</w:t>
@@ -3964,14 +3273,13 @@
         </w:tc>
         <w:tc>
           <w:tcPr>
-            <w:tcW w:type="dxa" w:w="1417"/>
+            <w:tcW w:type="dxa" w:w="1134"/>
             <w:shd w:val="clear" w:color="auto" w:fill="F5F5F5"/>
           </w:tcPr>
           <w:p>
             <w:r>
               <w:rPr>
-                <w:b w:val="0"/>
-                <w:sz w:val="17"/>
+                <w:sz w:val="18"/>
               </w:rPr>
               <w:t>Integer</w:t>
             </w:r>
@@ -3979,17 +3287,16 @@
         </w:tc>
         <w:tc>
           <w:tcPr>
-            <w:tcW w:type="dxa" w:w="5953"/>
+            <w:tcW w:type="dxa" w:w="6236"/>
             <w:shd w:val="clear" w:color="auto" w:fill="F5F5F5"/>
           </w:tcPr>
           <w:p>
             <w:r>
               <w:rPr>
                 <w:rFonts w:ascii="Courier New" w:hAnsi="Courier New"/>
-                <w:b w:val="0"/>
-                <w:sz w:val="16"/>
+                <w:sz w:val="17"/>
               </w:rPr>
-              <w:t>Drucker-ID (1–99). Weglassen → nächste freie ID</w:t>
+              <w:t>Drucker-ID. Weglassen → nächste freie ID</w:t>
             </w:r>
           </w:p>
         </w:tc>
@@ -4004,7 +3311,6 @@
             <w:r>
               <w:rPr>
                 <w:rFonts w:ascii="Courier New" w:hAnsi="Courier New"/>
-                <w:b/>
                 <w:sz w:val="17"/>
               </w:rPr>
               <w:t>name</w:t>
@@ -4013,14 +3319,13 @@
         </w:tc>
         <w:tc>
           <w:tcPr>
-            <w:tcW w:type="dxa" w:w="1417"/>
+            <w:tcW w:type="dxa" w:w="1134"/>
             <w:shd w:val="clear" w:color="auto" w:fill="FFFFFF"/>
           </w:tcPr>
           <w:p>
             <w:r>
               <w:rPr>
-                <w:b w:val="0"/>
-                <w:sz w:val="17"/>
+                <w:sz w:val="18"/>
               </w:rPr>
               <w:t>String</w:t>
             </w:r>
@@ -4028,17 +3333,16 @@
         </w:tc>
         <w:tc>
           <w:tcPr>
-            <w:tcW w:type="dxa" w:w="5953"/>
+            <w:tcW w:type="dxa" w:w="6236"/>
             <w:shd w:val="clear" w:color="auto" w:fill="FFFFFF"/>
           </w:tcPr>
           <w:p>
             <w:r>
               <w:rPr>
                 <w:rFonts w:ascii="Courier New" w:hAnsi="Courier New"/>
-                <w:b w:val="0"/>
-                <w:sz w:val="16"/>
+                <w:sz w:val="17"/>
               </w:rPr>
-              <w:t>Anzeigename, z. B. "Drucker 1"</w:t>
+              <w:t>Anzeigename</w:t>
             </w:r>
           </w:p>
         </w:tc>
@@ -4053,7 +3357,6 @@
             <w:r>
               <w:rPr>
                 <w:rFonts w:ascii="Courier New" w:hAnsi="Courier New"/>
-                <w:b/>
                 <w:sz w:val="17"/>
               </w:rPr>
               <w:t>pin_fertig</w:t>
@@ -4062,14 +3365,13 @@
         </w:tc>
         <w:tc>
           <w:tcPr>
-            <w:tcW w:type="dxa" w:w="1417"/>
+            <w:tcW w:type="dxa" w:w="1134"/>
             <w:shd w:val="clear" w:color="auto" w:fill="F5F5F5"/>
           </w:tcPr>
           <w:p>
             <w:r>
               <w:rPr>
-                <w:b w:val="0"/>
-                <w:sz w:val="17"/>
+                <w:sz w:val="18"/>
               </w:rPr>
               <w:t>Integer</w:t>
             </w:r>
@@ -4077,17 +3379,16 @@
         </w:tc>
         <w:tc>
           <w:tcPr>
-            <w:tcW w:type="dxa" w:w="5953"/>
+            <w:tcW w:type="dxa" w:w="6236"/>
             <w:shd w:val="clear" w:color="auto" w:fill="F5F5F5"/>
           </w:tcPr>
           <w:p>
             <w:r>
               <w:rPr>
                 <w:rFonts w:ascii="Courier New" w:hAnsi="Courier New"/>
-                <w:b w:val="0"/>
-                <w:sz w:val="16"/>
+                <w:sz w:val="17"/>
               </w:rPr>
-              <w:t>GPIO-BCM-Pin des Druckfertig-Signals, z. B. 17</w:t>
+              <w:t>GPIO-BCM-Pin des Druckfertig-Signals</w:t>
             </w:r>
           </w:p>
         </w:tc>
@@ -4102,7 +3403,6 @@
             <w:r>
               <w:rPr>
                 <w:rFonts w:ascii="Courier New" w:hAnsi="Courier New"/>
-                <w:b/>
                 <w:sz w:val="17"/>
               </w:rPr>
               <w:t>pos_x</w:t>
@@ -4111,14 +3411,13 @@
         </w:tc>
         <w:tc>
           <w:tcPr>
-            <w:tcW w:type="dxa" w:w="1417"/>
+            <w:tcW w:type="dxa" w:w="1134"/>
             <w:shd w:val="clear" w:color="auto" w:fill="FFFFFF"/>
           </w:tcPr>
           <w:p>
             <w:r>
               <w:rPr>
-                <w:b w:val="0"/>
-                <w:sz w:val="17"/>
+                <w:sz w:val="18"/>
               </w:rPr>
               <w:t>Integer</w:t>
             </w:r>
@@ -4126,17 +3425,16 @@
         </w:tc>
         <w:tc>
           <w:tcPr>
-            <w:tcW w:type="dxa" w:w="5953"/>
+            <w:tcW w:type="dxa" w:w="6236"/>
             <w:shd w:val="clear" w:color="auto" w:fill="FFFFFF"/>
           </w:tcPr>
           <w:p>
             <w:r>
               <w:rPr>
                 <w:rFonts w:ascii="Courier New" w:hAnsi="Courier New"/>
-                <w:b w:val="0"/>
-                <w:sz w:val="16"/>
+                <w:sz w:val="17"/>
               </w:rPr>
-              <w:t>X-Position des Druckers in mm</w:t>
+              <w:t>X-Position in mm</w:t>
             </w:r>
           </w:p>
         </w:tc>
@@ -4151,7 +3449,6 @@
             <w:r>
               <w:rPr>
                 <w:rFonts w:ascii="Courier New" w:hAnsi="Courier New"/>
-                <w:b/>
                 <w:sz w:val="17"/>
               </w:rPr>
               <w:t>pos_z_anfahr</w:t>
@@ -4160,14 +3457,13 @@
         </w:tc>
         <w:tc>
           <w:tcPr>
-            <w:tcW w:type="dxa" w:w="1417"/>
+            <w:tcW w:type="dxa" w:w="1134"/>
             <w:shd w:val="clear" w:color="auto" w:fill="F5F5F5"/>
           </w:tcPr>
           <w:p>
             <w:r>
               <w:rPr>
-                <w:b w:val="0"/>
-                <w:sz w:val="17"/>
+                <w:sz w:val="18"/>
               </w:rPr>
               <w:t>Integer</w:t>
             </w:r>
@@ -4175,17 +3471,16 @@
         </w:tc>
         <w:tc>
           <w:tcPr>
-            <w:tcW w:type="dxa" w:w="5953"/>
+            <w:tcW w:type="dxa" w:w="6236"/>
             <w:shd w:val="clear" w:color="auto" w:fill="F5F5F5"/>
           </w:tcPr>
           <w:p>
             <w:r>
               <w:rPr>
                 <w:rFonts w:ascii="Courier New" w:hAnsi="Courier New"/>
-                <w:b w:val="0"/>
-                <w:sz w:val="16"/>
+                <w:sz w:val="17"/>
               </w:rPr>
-              <w:t>Z-Position Anfahrt (sicherer Abstand) in mm</w:t>
+              <w:t>Z-Position Anfahrt in mm</w:t>
             </w:r>
           </w:p>
         </w:tc>
@@ -4200,7 +3495,6 @@
             <w:r>
               <w:rPr>
                 <w:rFonts w:ascii="Courier New" w:hAnsi="Courier New"/>
-                <w:b/>
                 <w:sz w:val="17"/>
               </w:rPr>
               <w:t>pos_z_tuer</w:t>
@@ -4209,14 +3503,13 @@
         </w:tc>
         <w:tc>
           <w:tcPr>
-            <w:tcW w:type="dxa" w:w="1417"/>
+            <w:tcW w:type="dxa" w:w="1134"/>
             <w:shd w:val="clear" w:color="auto" w:fill="FFFFFF"/>
           </w:tcPr>
           <w:p>
             <w:r>
               <w:rPr>
-                <w:b w:val="0"/>
-                <w:sz w:val="17"/>
+                <w:sz w:val="18"/>
               </w:rPr>
               <w:t>Integer</w:t>
             </w:r>
@@ -4224,15 +3517,14 @@
         </w:tc>
         <w:tc>
           <w:tcPr>
-            <w:tcW w:type="dxa" w:w="5953"/>
+            <w:tcW w:type="dxa" w:w="6236"/>
             <w:shd w:val="clear" w:color="auto" w:fill="FFFFFF"/>
           </w:tcPr>
           <w:p>
             <w:r>
               <w:rPr>
                 <w:rFonts w:ascii="Courier New" w:hAnsi="Courier New"/>
-                <w:b w:val="0"/>
-                <w:sz w:val="16"/>
+                <w:sz w:val="17"/>
               </w:rPr>
               <w:t>Z-Position Türarm in mm</w:t>
             </w:r>
@@ -4249,7 +3541,6 @@
             <w:r>
               <w:rPr>
                 <w:rFonts w:ascii="Courier New" w:hAnsi="Courier New"/>
-                <w:b/>
                 <w:sz w:val="17"/>
               </w:rPr>
               <w:t>pos_z_druckbett</w:t>
@@ -4258,14 +3549,13 @@
         </w:tc>
         <w:tc>
           <w:tcPr>
-            <w:tcW w:type="dxa" w:w="1417"/>
+            <w:tcW w:type="dxa" w:w="1134"/>
             <w:shd w:val="clear" w:color="auto" w:fill="F5F5F5"/>
           </w:tcPr>
           <w:p>
             <w:r>
               <w:rPr>
-                <w:b w:val="0"/>
-                <w:sz w:val="17"/>
+                <w:sz w:val="18"/>
               </w:rPr>
               <w:t>Integer</w:t>
             </w:r>
@@ -4273,17 +3563,16 @@
         </w:tc>
         <w:tc>
           <w:tcPr>
-            <w:tcW w:type="dxa" w:w="5953"/>
+            <w:tcW w:type="dxa" w:w="6236"/>
             <w:shd w:val="clear" w:color="auto" w:fill="F5F5F5"/>
           </w:tcPr>
           <w:p>
             <w:r>
               <w:rPr>
                 <w:rFonts w:ascii="Courier New" w:hAnsi="Courier New"/>
-                <w:b w:val="0"/>
-                <w:sz w:val="16"/>
+                <w:sz w:val="17"/>
               </w:rPr>
-              <w:t>Z-Position Druckbett (Gabel-Bereitschaft) in mm</w:t>
+              <w:t>Z-Position Druckbett in mm</w:t>
             </w:r>
           </w:p>
         </w:tc>
@@ -4298,7 +3587,6 @@
             <w:r>
               <w:rPr>
                 <w:rFonts w:ascii="Courier New" w:hAnsi="Courier New"/>
-                <w:b/>
                 <w:sz w:val="17"/>
               </w:rPr>
               <w:t>door_arm_hub_mm</w:t>
@@ -4307,14 +3595,13 @@
         </w:tc>
         <w:tc>
           <w:tcPr>
-            <w:tcW w:type="dxa" w:w="1417"/>
+            <w:tcW w:type="dxa" w:w="1134"/>
             <w:shd w:val="clear" w:color="auto" w:fill="FFFFFF"/>
           </w:tcPr>
           <w:p>
             <w:r>
               <w:rPr>
-                <w:b w:val="0"/>
-                <w:sz w:val="17"/>
+                <w:sz w:val="18"/>
               </w:rPr>
               <w:t>Integer</w:t>
             </w:r>
@@ -4322,17 +3609,16 @@
         </w:tc>
         <w:tc>
           <w:tcPr>
-            <w:tcW w:type="dxa" w:w="5953"/>
+            <w:tcW w:type="dxa" w:w="6236"/>
             <w:shd w:val="clear" w:color="auto" w:fill="FFFFFF"/>
           </w:tcPr>
           <w:p>
             <w:r>
               <w:rPr>
                 <w:rFonts w:ascii="Courier New" w:hAnsi="Courier New"/>
-                <w:b w:val="0"/>
-                <w:sz w:val="16"/>
+                <w:sz w:val="17"/>
               </w:rPr>
-              <w:t>Hubbewegung des Türarms in mm</w:t>
+              <w:t>Hubbewegung Türarm in mm</w:t>
             </w:r>
           </w:p>
         </w:tc>
@@ -4347,7 +3633,6 @@
             <w:r>
               <w:rPr>
                 <w:rFonts w:ascii="Courier New" w:hAnsi="Courier New"/>
-                <w:b/>
                 <w:sz w:val="17"/>
               </w:rPr>
               <w:t>gripper_depth</w:t>
@@ -4356,14 +3641,13 @@
         </w:tc>
         <w:tc>
           <w:tcPr>
-            <w:tcW w:type="dxa" w:w="1417"/>
+            <w:tcW w:type="dxa" w:w="1134"/>
             <w:shd w:val="clear" w:color="auto" w:fill="F5F5F5"/>
           </w:tcPr>
           <w:p>
             <w:r>
               <w:rPr>
-                <w:b w:val="0"/>
-                <w:sz w:val="17"/>
+                <w:sz w:val="18"/>
               </w:rPr>
               <w:t>Integer</w:t>
             </w:r>
@@ -4371,17 +3655,16 @@
         </w:tc>
         <w:tc>
           <w:tcPr>
-            <w:tcW w:type="dxa" w:w="5953"/>
+            <w:tcW w:type="dxa" w:w="6236"/>
             <w:shd w:val="clear" w:color="auto" w:fill="F5F5F5"/>
           </w:tcPr>
           <w:p>
             <w:r>
               <w:rPr>
                 <w:rFonts w:ascii="Courier New" w:hAnsi="Courier New"/>
-                <w:b w:val="0"/>
-                <w:sz w:val="16"/>
+                <w:sz w:val="17"/>
               </w:rPr>
-              <w:t>Greifertiefe für PICKUP/DEPOSIT in mm</w:t>
+              <w:t>Greifertiefe in mm</w:t>
             </w:r>
           </w:p>
         </w:tc>
@@ -4396,7 +3679,6 @@
             <w:r>
               <w:rPr>
                 <w:rFonts w:ascii="Courier New" w:hAnsi="Courier New"/>
-                <w:b/>
                 <w:sz w:val="17"/>
               </w:rPr>
               <w:t>lift_offset</w:t>
@@ -4405,14 +3687,13 @@
         </w:tc>
         <w:tc>
           <w:tcPr>
-            <w:tcW w:type="dxa" w:w="1417"/>
+            <w:tcW w:type="dxa" w:w="1134"/>
             <w:shd w:val="clear" w:color="auto" w:fill="FFFFFF"/>
           </w:tcPr>
           <w:p>
             <w:r>
               <w:rPr>
-                <w:b w:val="0"/>
-                <w:sz w:val="17"/>
+                <w:sz w:val="18"/>
               </w:rPr>
               <w:t>Integer</w:t>
             </w:r>
@@ -4420,59 +3701,21 @@
         </w:tc>
         <w:tc>
           <w:tcPr>
-            <w:tcW w:type="dxa" w:w="5953"/>
+            <w:tcW w:type="dxa" w:w="6236"/>
             <w:shd w:val="clear" w:color="auto" w:fill="FFFFFF"/>
           </w:tcPr>
           <w:p>
             <w:r>
               <w:rPr>
                 <w:rFonts w:ascii="Courier New" w:hAnsi="Courier New"/>
-                <w:b w:val="0"/>
-                <w:sz w:val="16"/>
+                <w:sz w:val="17"/>
               </w:rPr>
-              <w:t>Hub-Offset beim Greifer in mm</w:t>
+              <w:t>Hub-Offset in mm</w:t>
             </w:r>
           </w:p>
         </w:tc>
       </w:tr>
     </w:tbl>
-    <w:p>
-      <w:pPr>
-        <w:spacing w:before="120" w:after="80"/>
-      </w:pPr>
-      <w:r>
-        <w:rPr>
-          <w:rFonts w:ascii="Courier New" w:hAnsi="Courier New"/>
-          <w:color w:val="2A2C32"/>
-          <w:sz w:val="18"/>
-        </w:rPr>
-        <w:t>Beispiel:</w:t>
-        <w:br/>
-        <w:t>{</w:t>
-        <w:br/>
-        <w:t xml:space="preserve">  "id": 3,</w:t>
-        <w:br/>
-        <w:t xml:space="preserve">  "name": "Drucker 3",</w:t>
-        <w:br/>
-        <w:t xml:space="preserve">  "pin_fertig": 22,</w:t>
-        <w:br/>
-        <w:t xml:space="preserve">  "pos_x": 300,</w:t>
-        <w:br/>
-        <w:t xml:space="preserve">  "pos_z_anfahr": 200,</w:t>
-        <w:br/>
-        <w:t xml:space="preserve">  "pos_z_tuer": 220,</w:t>
-        <w:br/>
-        <w:t xml:space="preserve">  "pos_z_druckbett": 50,</w:t>
-        <w:br/>
-        <w:t xml:space="preserve">  "door_arm_hub_mm": 50,</w:t>
-        <w:br/>
-        <w:t xml:space="preserve">  "gripper_depth": 120,</w:t>
-        <w:br/>
-        <w:t xml:space="preserve">  "lift_offset": 8</w:t>
-        <w:br/>
-        <w:t>}</w:t>
-      </w:r>
-    </w:p>
     <w:p>
       <w:pPr>
         <w:pStyle w:val="Heading1"/>
@@ -4482,18 +3725,6 @@
           <w:color w:val="C8102E"/>
         </w:rPr>
         <w:t>7  Beispiel-Ablauf: Plattenwechsel auslösen</w:t>
-      </w:r>
-    </w:p>
-    <w:p>
-      <w:pPr>
-        <w:spacing w:before="0" w:after="120"/>
-      </w:pPr>
-      <w:r>
-        <w:rPr>
-          <w:b w:val="0"/>
-          <w:sz w:val="20"/>
-        </w:rPr>
-        <w:t>Der folgende Ablauf zeigt, wie ein Plattenwechsel für Drucker 2 über die App angefordert und verfolgt wird:</w:t>
       </w:r>
     </w:p>
     <w:p>
@@ -4512,7 +3743,7 @@
         <w:rPr>
           <w:sz w:val="20"/>
         </w:rPr>
-        <w:t>App mit Broker verbinden (Kapitel 2). Status sollte auf  plattenwechsler/status/system  system_state = "BEREITSCHAFT"  zeigen.</w:t>
+        <w:t>App mit Broker verbinden: Host = broker.hivemq.com, Port = 1883.</w:t>
       </w:r>
     </w:p>
     <w:p>
@@ -4531,7 +3762,7 @@
         <w:rPr>
           <w:sz w:val="20"/>
         </w:rPr>
-        <w:t>Topic  plattenwechsler/#  abonnieren, um alle Antworten zu sehen.</w:t>
+        <w:t>Topic  plattenwechsler-g6twie23a/#  abonnieren.</w:t>
       </w:r>
     </w:p>
     <w:p>
@@ -4550,9 +3781,9 @@
         <w:rPr>
           <w:sz w:val="20"/>
         </w:rPr>
-        <w:t>Auf  plattenwechsler/cmd/auftrag  publizieren:</w:t>
+        <w:t>Topic: plattenwechsler-g6twie23a/cmd/auftrag</w:t>
         <w:br/>
-        <w:t>{"drucker_id": 2}</w:t>
+        <w:t>Payload: {"drucker_id": 1}</w:t>
       </w:r>
     </w:p>
     <w:p>
@@ -4571,28 +3802,7 @@
         <w:rPr>
           <w:sz w:val="20"/>
         </w:rPr>
-        <w:t>Auf  plattenwechsler/response  erscheint:</w:t>
-        <w:br/>
-        <w:t>{"cmd": "auftrag", "ok": true, "msg": "Drucker 2 in Queue", "ts": ...}</w:t>
-      </w:r>
-    </w:p>
-    <w:p>
-      <w:pPr>
-        <w:pStyle w:val="ListNumber"/>
-        <w:spacing w:after="100"/>
-      </w:pPr>
-      <w:r>
-        <w:rPr>
-          <w:b/>
-          <w:sz w:val="20"/>
-        </w:rPr>
-        <w:t xml:space="preserve">Fortschritt beobachten:  </w:t>
-      </w:r>
-      <w:r>
-        <w:rPr>
-          <w:sz w:val="20"/>
-        </w:rPr>
-        <w:t>system_state wechselt zu "PLATTENWECHSEL". drucker_status["2"] wechselt zu "aktiv".</w:t>
+        <w:t>Auf  plattenwechsler-g6twie23a/response  erscheint: {"cmd": "auftrag", "ok": true, "msg": "Drucker 1 in Queue"}</w:t>
       </w:r>
     </w:p>
     <w:p>
@@ -4611,7 +3821,7 @@
         <w:rPr>
           <w:sz w:val="20"/>
         </w:rPr>
-        <w:t>Nach erfolgreichem Wechsel erscheint auf  plattenwechsler/event/auftrag  ein Ereignis, system_state geht zurück auf "BEREITSCHAFT".</w:t>
+        <w:t>Nach dem Wechsel erscheint ein Ereignis auf  plattenwechsler-g6twie23a/event/auftrag.</w:t>
       </w:r>
     </w:p>
     <w:p>
@@ -4623,18 +3833,6 @@
           <w:color w:val="C8102E"/>
         </w:rPr>
         <w:t>8  Fehlerbehandlung</w:t>
-      </w:r>
-    </w:p>
-    <w:p>
-      <w:pPr>
-        <w:spacing w:before="0" w:after="120"/>
-      </w:pPr>
-      <w:r>
-        <w:rPr>
-          <w:b w:val="0"/>
-          <w:sz w:val="20"/>
-        </w:rPr>
-        <w:t>Tritt ein Fehler auf, wechselt system_state zu "FEHLER" und auf plattenwechsler/error wird ein Ereignis veröffentlicht. Der Plattenwechsel wird abgebrochen. Vorgehen:</w:t>
       </w:r>
     </w:p>
     <w:p>
@@ -4653,7 +3851,7 @@
         <w:rPr>
           <w:sz w:val="20"/>
         </w:rPr>
-        <w:t>plattenwechsler/error  oder  plattenwechsler/status/system → fehler  auswerten.</w:t>
+        <w:t>plattenwechsler-g6twie23a/error  oder  plattenwechsler-g6twie23a/status/system → fehler  auswerten.</w:t>
       </w:r>
     </w:p>
     <w:p>
@@ -4691,7 +3889,7 @@
         <w:rPr>
           <w:sz w:val="20"/>
         </w:rPr>
-        <w:t>Auf  plattenwechsler/cmd/quittieren  publizieren:  {}</w:t>
+        <w:t>Topic: plattenwechsler-g6twie23a/cmd/quittieren   Payload: {}</w:t>
       </w:r>
     </w:p>
     <w:p>
@@ -4710,575 +3908,9 @@
         <w:rPr>
           <w:sz w:val="20"/>
         </w:rPr>
-        <w:t>plattenwechsler/response  zeigt  {"ok": true, "msg": "Fehler quittiert"}, system_state kehrt zu "BEREITSCHAFT" zurück.</w:t>
+        <w:t>plattenwechsler-g6twie23a/response  zeigt  {"ok": true, "msg": "Fehler quittiert"}.</w:t>
       </w:r>
     </w:p>
-    <w:p>
-      <w:pPr>
-        <w:spacing w:before="280" w:after="40"/>
-      </w:pPr>
-      <w:r>
-        <w:rPr>
-          <w:b/>
-          <w:color w:val="9A9CA0"/>
-          <w:sz w:val="16"/>
-        </w:rPr>
-        <w:t>FEHLERCODES (ESP)</w:t>
-      </w:r>
-    </w:p>
-    <w:tbl>
-      <w:tblPr>
-        <w:tblStyle w:val="TableGrid"/>
-        <w:tblW w:type="auto" w:w="0"/>
-        <w:jc w:val="left"/>
-        <w:tblLook w:firstColumn="1" w:firstRow="1" w:lastColumn="0" w:lastRow="0" w:noHBand="0" w:noVBand="1" w:val="04A0"/>
-      </w:tblPr>
-      <w:tblGrid>
-        <w:gridCol w:w="3024"/>
-        <w:gridCol w:w="3024"/>
-        <w:gridCol w:w="3024"/>
-      </w:tblGrid>
-      <w:tr>
-        <w:tc>
-          <w:tcPr>
-            <w:tcW w:type="dxa" w:w="2551"/>
-            <w:shd w:val="clear" w:color="auto" w:fill="34363C"/>
-          </w:tcPr>
-          <w:p>
-            <w:r>
-              <w:rPr>
-                <w:b/>
-                <w:color w:val="FFFFFF"/>
-                <w:sz w:val="18"/>
-              </w:rPr>
-              <w:t>Feld</w:t>
-            </w:r>
-          </w:p>
-        </w:tc>
-        <w:tc>
-          <w:tcPr>
-            <w:tcW w:type="dxa" w:w="1417"/>
-            <w:shd w:val="clear" w:color="auto" w:fill="34363C"/>
-          </w:tcPr>
-          <w:p>
-            <w:r>
-              <w:rPr>
-                <w:b/>
-                <w:color w:val="FFFFFF"/>
-                <w:sz w:val="18"/>
-              </w:rPr>
-              <w:t>Typ</w:t>
-            </w:r>
-          </w:p>
-        </w:tc>
-        <w:tc>
-          <w:tcPr>
-            <w:tcW w:type="dxa" w:w="5953"/>
-            <w:shd w:val="clear" w:color="auto" w:fill="34363C"/>
-          </w:tcPr>
-          <w:p>
-            <w:r>
-              <w:rPr>
-                <w:b/>
-                <w:color w:val="FFFFFF"/>
-                <w:sz w:val="18"/>
-              </w:rPr>
-              <w:t>Mögliche Werte / Beispiel</w:t>
-            </w:r>
-          </w:p>
-        </w:tc>
-      </w:tr>
-      <w:tr>
-        <w:tc>
-          <w:tcPr>
-            <w:tcW w:type="dxa" w:w="2551"/>
-            <w:shd w:val="clear" w:color="auto" w:fill="F5F5F5"/>
-          </w:tcPr>
-          <w:p>
-            <w:r>
-              <w:rPr>
-                <w:rFonts w:ascii="Courier New" w:hAnsi="Courier New"/>
-                <w:b/>
-                <w:sz w:val="17"/>
-              </w:rPr>
-              <w:t>OBSTACLE</w:t>
-            </w:r>
-          </w:p>
-        </w:tc>
-        <w:tc>
-          <w:tcPr>
-            <w:tcW w:type="dxa" w:w="1417"/>
-            <w:shd w:val="clear" w:color="auto" w:fill="F5F5F5"/>
-          </w:tcPr>
-          <w:p>
-            <w:r>
-              <w:rPr>
-                <w:b w:val="0"/>
-                <w:sz w:val="17"/>
-              </w:rPr>
-              <w:t>Hindernis</w:t>
-            </w:r>
-          </w:p>
-        </w:tc>
-        <w:tc>
-          <w:tcPr>
-            <w:tcW w:type="dxa" w:w="5953"/>
-            <w:shd w:val="clear" w:color="auto" w:fill="F5F5F5"/>
-          </w:tcPr>
-          <w:p>
-            <w:r>
-              <w:rPr>
-                <w:rFonts w:ascii="Courier New" w:hAnsi="Courier New"/>
-                <w:b w:val="0"/>
-                <w:sz w:val="16"/>
-              </w:rPr>
-              <w:t>Hindernis im Fahrweg erkannt (TF-Luna-Sensor)</w:t>
-            </w:r>
-          </w:p>
-        </w:tc>
-      </w:tr>
-      <w:tr>
-        <w:tc>
-          <w:tcPr>
-            <w:tcW w:type="dxa" w:w="2551"/>
-            <w:shd w:val="clear" w:color="auto" w:fill="FFFFFF"/>
-          </w:tcPr>
-          <w:p>
-            <w:r>
-              <w:rPr>
-                <w:rFonts w:ascii="Courier New" w:hAnsi="Courier New"/>
-                <w:b/>
-                <w:sz w:val="17"/>
-              </w:rPr>
-              <w:t>MOVE_TIMEOUT</w:t>
-            </w:r>
-          </w:p>
-        </w:tc>
-        <w:tc>
-          <w:tcPr>
-            <w:tcW w:type="dxa" w:w="1417"/>
-            <w:shd w:val="clear" w:color="auto" w:fill="FFFFFF"/>
-          </w:tcPr>
-          <w:p>
-            <w:r>
-              <w:rPr>
-                <w:b w:val="0"/>
-                <w:sz w:val="17"/>
-              </w:rPr>
-              <w:t>Fahrfehler</w:t>
-            </w:r>
-          </w:p>
-        </w:tc>
-        <w:tc>
-          <w:tcPr>
-            <w:tcW w:type="dxa" w:w="5953"/>
-            <w:shd w:val="clear" w:color="auto" w:fill="FFFFFF"/>
-          </w:tcPr>
-          <w:p>
-            <w:r>
-              <w:rPr>
-                <w:rFonts w:ascii="Courier New" w:hAnsi="Courier New"/>
-                <w:b w:val="0"/>
-                <w:sz w:val="16"/>
-              </w:rPr>
-              <w:t>Schlitten hat Zielposition nicht rechtzeitig erreicht</w:t>
-            </w:r>
-          </w:p>
-        </w:tc>
-      </w:tr>
-      <w:tr>
-        <w:tc>
-          <w:tcPr>
-            <w:tcW w:type="dxa" w:w="2551"/>
-            <w:shd w:val="clear" w:color="auto" w:fill="F5F5F5"/>
-          </w:tcPr>
-          <w:p>
-            <w:r>
-              <w:rPr>
-                <w:rFonts w:ascii="Courier New" w:hAnsi="Courier New"/>
-                <w:b/>
-                <w:sz w:val="17"/>
-              </w:rPr>
-              <w:t>HOMING_TIMEOUT</w:t>
-            </w:r>
-          </w:p>
-        </w:tc>
-        <w:tc>
-          <w:tcPr>
-            <w:tcW w:type="dxa" w:w="1417"/>
-            <w:shd w:val="clear" w:color="auto" w:fill="F5F5F5"/>
-          </w:tcPr>
-          <w:p>
-            <w:r>
-              <w:rPr>
-                <w:b w:val="0"/>
-                <w:sz w:val="17"/>
-              </w:rPr>
-              <w:t>Fahrfehler</w:t>
-            </w:r>
-          </w:p>
-        </w:tc>
-        <w:tc>
-          <w:tcPr>
-            <w:tcW w:type="dxa" w:w="5953"/>
-            <w:shd w:val="clear" w:color="auto" w:fill="F5F5F5"/>
-          </w:tcPr>
-          <w:p>
-            <w:r>
-              <w:rPr>
-                <w:rFonts w:ascii="Courier New" w:hAnsi="Courier New"/>
-                <w:b w:val="0"/>
-                <w:sz w:val="16"/>
-              </w:rPr>
-              <w:t>Referenzfahrt hat Zeitlimit überschritten</w:t>
-            </w:r>
-          </w:p>
-        </w:tc>
-      </w:tr>
-      <w:tr>
-        <w:tc>
-          <w:tcPr>
-            <w:tcW w:type="dxa" w:w="2551"/>
-            <w:shd w:val="clear" w:color="auto" w:fill="FFFFFF"/>
-          </w:tcPr>
-          <w:p>
-            <w:r>
-              <w:rPr>
-                <w:rFonts w:ascii="Courier New" w:hAnsi="Courier New"/>
-                <w:b/>
-                <w:sz w:val="17"/>
-              </w:rPr>
-              <w:t>DOOR_NOT_OPEN</w:t>
-            </w:r>
-          </w:p>
-        </w:tc>
-        <w:tc>
-          <w:tcPr>
-            <w:tcW w:type="dxa" w:w="1417"/>
-            <w:shd w:val="clear" w:color="auto" w:fill="FFFFFF"/>
-          </w:tcPr>
-          <w:p>
-            <w:r>
-              <w:rPr>
-                <w:b w:val="0"/>
-                <w:sz w:val="17"/>
-              </w:rPr>
-              <w:t>Türfehler</w:t>
-            </w:r>
-          </w:p>
-        </w:tc>
-        <w:tc>
-          <w:tcPr>
-            <w:tcW w:type="dxa" w:w="5953"/>
-            <w:shd w:val="clear" w:color="auto" w:fill="FFFFFF"/>
-          </w:tcPr>
-          <w:p>
-            <w:r>
-              <w:rPr>
-                <w:rFonts w:ascii="Courier New" w:hAnsi="Courier New"/>
-                <w:b w:val="0"/>
-                <w:sz w:val="16"/>
-              </w:rPr>
-              <w:t>Tür hat sich nicht geöffnet (VL53L0X-Sensor)</w:t>
-            </w:r>
-          </w:p>
-        </w:tc>
-      </w:tr>
-      <w:tr>
-        <w:tc>
-          <w:tcPr>
-            <w:tcW w:type="dxa" w:w="2551"/>
-            <w:shd w:val="clear" w:color="auto" w:fill="F5F5F5"/>
-          </w:tcPr>
-          <w:p>
-            <w:r>
-              <w:rPr>
-                <w:rFonts w:ascii="Courier New" w:hAnsi="Courier New"/>
-                <w:b/>
-                <w:sz w:val="17"/>
-              </w:rPr>
-              <w:t>PLATE_NOT_DETECTED</w:t>
-            </w:r>
-          </w:p>
-        </w:tc>
-        <w:tc>
-          <w:tcPr>
-            <w:tcW w:type="dxa" w:w="1417"/>
-            <w:shd w:val="clear" w:color="auto" w:fill="F5F5F5"/>
-          </w:tcPr>
-          <w:p>
-            <w:r>
-              <w:rPr>
-                <w:b w:val="0"/>
-                <w:sz w:val="17"/>
-              </w:rPr>
-              <w:t>Entnahmefehler</w:t>
-            </w:r>
-          </w:p>
-        </w:tc>
-        <w:tc>
-          <w:tcPr>
-            <w:tcW w:type="dxa" w:w="5953"/>
-            <w:shd w:val="clear" w:color="auto" w:fill="F5F5F5"/>
-          </w:tcPr>
-          <w:p>
-            <w:r>
-              <w:rPr>
-                <w:rFonts w:ascii="Courier New" w:hAnsi="Courier New"/>
-                <w:b w:val="0"/>
-                <w:sz w:val="16"/>
-              </w:rPr>
-              <w:t>Platte nach PICKUP nicht auf Gabel erkannt</w:t>
-            </w:r>
-          </w:p>
-        </w:tc>
-      </w:tr>
-      <w:tr>
-        <w:tc>
-          <w:tcPr>
-            <w:tcW w:type="dxa" w:w="2551"/>
-            <w:shd w:val="clear" w:color="auto" w:fill="FFFFFF"/>
-          </w:tcPr>
-          <w:p>
-            <w:r>
-              <w:rPr>
-                <w:rFonts w:ascii="Courier New" w:hAnsi="Courier New"/>
-                <w:b/>
-                <w:sz w:val="17"/>
-              </w:rPr>
-              <w:t>SENSOR_FAULT_OBSTACLE</w:t>
-            </w:r>
-          </w:p>
-        </w:tc>
-        <w:tc>
-          <w:tcPr>
-            <w:tcW w:type="dxa" w:w="1417"/>
-            <w:shd w:val="clear" w:color="auto" w:fill="FFFFFF"/>
-          </w:tcPr>
-          <w:p>
-            <w:r>
-              <w:rPr>
-                <w:b w:val="0"/>
-                <w:sz w:val="17"/>
-              </w:rPr>
-              <w:t>Sensorfehler</w:t>
-            </w:r>
-          </w:p>
-        </w:tc>
-        <w:tc>
-          <w:tcPr>
-            <w:tcW w:type="dxa" w:w="5953"/>
-            <w:shd w:val="clear" w:color="auto" w:fill="FFFFFF"/>
-          </w:tcPr>
-          <w:p>
-            <w:r>
-              <w:rPr>
-                <w:rFonts w:ascii="Courier New" w:hAnsi="Courier New"/>
-                <w:b w:val="0"/>
-                <w:sz w:val="16"/>
-              </w:rPr>
-              <w:t>TF-Luna-Hindernissensor antwortet nicht</w:t>
-            </w:r>
-          </w:p>
-        </w:tc>
-      </w:tr>
-      <w:tr>
-        <w:tc>
-          <w:tcPr>
-            <w:tcW w:type="dxa" w:w="2551"/>
-            <w:shd w:val="clear" w:color="auto" w:fill="F5F5F5"/>
-          </w:tcPr>
-          <w:p>
-            <w:r>
-              <w:rPr>
-                <w:rFonts w:ascii="Courier New" w:hAnsi="Courier New"/>
-                <w:b/>
-                <w:sz w:val="17"/>
-              </w:rPr>
-              <w:t>SENSOR_FAULT_GRIPPER</w:t>
-            </w:r>
-          </w:p>
-        </w:tc>
-        <w:tc>
-          <w:tcPr>
-            <w:tcW w:type="dxa" w:w="1417"/>
-            <w:shd w:val="clear" w:color="auto" w:fill="F5F5F5"/>
-          </w:tcPr>
-          <w:p>
-            <w:r>
-              <w:rPr>
-                <w:b w:val="0"/>
-                <w:sz w:val="17"/>
-              </w:rPr>
-              <w:t>Sensorfehler</w:t>
-            </w:r>
-          </w:p>
-        </w:tc>
-        <w:tc>
-          <w:tcPr>
-            <w:tcW w:type="dxa" w:w="5953"/>
-            <w:shd w:val="clear" w:color="auto" w:fill="F5F5F5"/>
-          </w:tcPr>
-          <w:p>
-            <w:r>
-              <w:rPr>
-                <w:rFonts w:ascii="Courier New" w:hAnsi="Courier New"/>
-                <w:b w:val="0"/>
-                <w:sz w:val="16"/>
-              </w:rPr>
-              <w:t>Greifer-Sensor antwortet nicht</w:t>
-            </w:r>
-          </w:p>
-        </w:tc>
-      </w:tr>
-      <w:tr>
-        <w:tc>
-          <w:tcPr>
-            <w:tcW w:type="dxa" w:w="2551"/>
-            <w:shd w:val="clear" w:color="auto" w:fill="FFFFFF"/>
-          </w:tcPr>
-          <w:p>
-            <w:r>
-              <w:rPr>
-                <w:rFonts w:ascii="Courier New" w:hAnsi="Courier New"/>
-                <w:b/>
-                <w:sz w:val="17"/>
-              </w:rPr>
-              <w:t>NOT_REFERENCED</w:t>
-            </w:r>
-          </w:p>
-        </w:tc>
-        <w:tc>
-          <w:tcPr>
-            <w:tcW w:type="dxa" w:w="1417"/>
-            <w:shd w:val="clear" w:color="auto" w:fill="FFFFFF"/>
-          </w:tcPr>
-          <w:p>
-            <w:r>
-              <w:rPr>
-                <w:b w:val="0"/>
-                <w:sz w:val="17"/>
-              </w:rPr>
-              <w:t>Fahrfehler</w:t>
-            </w:r>
-          </w:p>
-        </w:tc>
-        <w:tc>
-          <w:tcPr>
-            <w:tcW w:type="dxa" w:w="5953"/>
-            <w:shd w:val="clear" w:color="auto" w:fill="FFFFFF"/>
-          </w:tcPr>
-          <w:p>
-            <w:r>
-              <w:rPr>
-                <w:rFonts w:ascii="Courier New" w:hAnsi="Courier New"/>
-                <w:b w:val="0"/>
-                <w:sz w:val="16"/>
-              </w:rPr>
-              <w:t>Bewegungsbefehl ohne vorherige Referenzfahrt</w:t>
-            </w:r>
-          </w:p>
-        </w:tc>
-      </w:tr>
-      <w:tr>
-        <w:tc>
-          <w:tcPr>
-            <w:tcW w:type="dxa" w:w="2551"/>
-            <w:shd w:val="clear" w:color="auto" w:fill="F5F5F5"/>
-          </w:tcPr>
-          <w:p>
-            <w:r>
-              <w:rPr>
-                <w:rFonts w:ascii="Courier New" w:hAnsi="Courier New"/>
-                <w:b/>
-                <w:sz w:val="17"/>
-              </w:rPr>
-              <w:t>DRIVER_FAULT</w:t>
-            </w:r>
-          </w:p>
-        </w:tc>
-        <w:tc>
-          <w:tcPr>
-            <w:tcW w:type="dxa" w:w="1417"/>
-            <w:shd w:val="clear" w:color="auto" w:fill="F5F5F5"/>
-          </w:tcPr>
-          <w:p>
-            <w:r>
-              <w:rPr>
-                <w:b w:val="0"/>
-                <w:sz w:val="17"/>
-              </w:rPr>
-              <w:t>Fahrfehler</w:t>
-            </w:r>
-          </w:p>
-        </w:tc>
-        <w:tc>
-          <w:tcPr>
-            <w:tcW w:type="dxa" w:w="5953"/>
-            <w:shd w:val="clear" w:color="auto" w:fill="F5F5F5"/>
-          </w:tcPr>
-          <w:p>
-            <w:r>
-              <w:rPr>
-                <w:rFonts w:ascii="Courier New" w:hAnsi="Courier New"/>
-                <w:b w:val="0"/>
-                <w:sz w:val="16"/>
-              </w:rPr>
-              <w:t>Motortreiber-Fehler (Übertemperatur, Überstrom)</w:t>
-            </w:r>
-          </w:p>
-        </w:tc>
-      </w:tr>
-      <w:tr>
-        <w:tc>
-          <w:tcPr>
-            <w:tcW w:type="dxa" w:w="2551"/>
-            <w:shd w:val="clear" w:color="auto" w:fill="FFFFFF"/>
-          </w:tcPr>
-          <w:p>
-            <w:r>
-              <w:rPr>
-                <w:rFonts w:ascii="Courier New" w:hAnsi="Courier New"/>
-                <w:b/>
-                <w:sz w:val="17"/>
-              </w:rPr>
-              <w:t>BUSY</w:t>
-            </w:r>
-          </w:p>
-        </w:tc>
-        <w:tc>
-          <w:tcPr>
-            <w:tcW w:type="dxa" w:w="1417"/>
-            <w:shd w:val="clear" w:color="auto" w:fill="FFFFFF"/>
-          </w:tcPr>
-          <w:p>
-            <w:r>
-              <w:rPr>
-                <w:b w:val="0"/>
-                <w:sz w:val="17"/>
-              </w:rPr>
-              <w:t>Kommunikation</w:t>
-            </w:r>
-          </w:p>
-        </w:tc>
-        <w:tc>
-          <w:tcPr>
-            <w:tcW w:type="dxa" w:w="5953"/>
-            <w:shd w:val="clear" w:color="auto" w:fill="FFFFFF"/>
-          </w:tcPr>
-          <w:p>
-            <w:r>
-              <w:rPr>
-                <w:rFonts w:ascii="Courier New" w:hAnsi="Courier New"/>
-                <w:b w:val="0"/>
-                <w:sz w:val="16"/>
-              </w:rPr>
-              <w:t>ESP ist beschäftigt, Befehl wurde abgelehnt</w:t>
-            </w:r>
-          </w:p>
-        </w:tc>
-      </w:tr>
-    </w:tbl>
     <w:p>
       <w:pPr>
         <w:spacing w:before="120" w:after="120"/>
@@ -5297,7 +3929,7 @@
           <w:color w:val="9A9CA0"/>
           <w:sz w:val="16"/>
         </w:rPr>
-        <w:t>Plattenwechsler · G6-TWIE23A · DHBW Stuttgart · MQTT-Schnittstelle v1.0 · Mai 2026</w:t>
+        <w:t>Plattenwechsler · G6-TWIE23A · DHBW Stuttgart · MQTT-Schnittstelle v2.0 · Mai 2026</w:t>
       </w:r>
     </w:p>
     <w:sectPr>

</xml_diff>